<commit_message>
commit before name change of tesztnodejs
</commit_message>
<xml_diff>
--- a/szakdolgozat jegyzetek.docx
+++ b/szakdolgozat jegyzetek.docx
@@ -1732,19 +1732,7 @@
           <w:rPr>
             <w:rStyle w:val="Hiperhivatkozs"/>
           </w:rPr>
-          <w:t>https://www.ema</w:t>
-        </w:r>
-        <w:r>
-          <w:rPr>
-            <w:rStyle w:val="Hiperhivatkozs"/>
-          </w:rPr>
-          <w:t>g</w:t>
-        </w:r>
-        <w:r>
-          <w:rPr>
-            <w:rStyle w:val="Hiperhivatkozs"/>
-          </w:rPr>
-          <w:t>.hu/noveny-nevelo-virag-agyas-smart-pot-glb-300000127/pd/D62BDQMBM/</w:t>
+          <w:t>https://www.emag.hu/noveny-nevelo-virag-agyas-smart-pot-glb-300000127/pd/D62BDQMBM/</w:t>
         </w:r>
       </w:hyperlink>
     </w:p>
@@ -1890,19 +1878,7 @@
           <w:rPr>
             <w:rStyle w:val="Hiperhivatkozs"/>
           </w:rPr>
-          <w:t>https://www.kickstarter.c</w:t>
-        </w:r>
-        <w:r>
-          <w:rPr>
-            <w:rStyle w:val="Hiperhivatkozs"/>
-          </w:rPr>
-          <w:t>o</w:t>
-        </w:r>
-        <w:r>
-          <w:rPr>
-            <w:rStyle w:val="Hiperhivatkozs"/>
-          </w:rPr>
-          <w:t>m/projects/pretapousser/nano-garden-by-pret-a-pousser</w:t>
+          <w:t>https://www.kickstarter.com/projects/pretapousser/nano-garden-by-pret-a-pousser</w:t>
         </w:r>
       </w:hyperlink>
     </w:p>
@@ -1967,19 +1943,7 @@
           <w:rPr>
             <w:rStyle w:val="Hiperhivatkozs"/>
           </w:rPr>
-          <w:t>https://smar</w:t>
-        </w:r>
-        <w:r>
-          <w:rPr>
-            <w:rStyle w:val="Hiperhivatkozs"/>
-          </w:rPr>
-          <w:t>t</w:t>
-        </w:r>
-        <w:r>
-          <w:rPr>
-            <w:rStyle w:val="Hiperhivatkozs"/>
-          </w:rPr>
-          <w:t>plantivy.com/products/ivy</w:t>
+          <w:t>https://smartplantivy.com/products/ivy</w:t>
         </w:r>
       </w:hyperlink>
     </w:p>
@@ -2079,19 +2043,7 @@
           <w:rPr>
             <w:rStyle w:val="Hiperhivatkozs"/>
           </w:rPr>
-          <w:t>https://ieeex</w:t>
-        </w:r>
-        <w:r>
-          <w:rPr>
-            <w:rStyle w:val="Hiperhivatkozs"/>
-          </w:rPr>
-          <w:t>p</w:t>
-        </w:r>
-        <w:r>
-          <w:rPr>
-            <w:rStyle w:val="Hiperhivatkozs"/>
-          </w:rPr>
-          <w:t>lore.ieee.org/document/8907989</w:t>
+          <w:t>https://ieeexplore.ieee.org/document/8907989</w:t>
         </w:r>
       </w:hyperlink>
     </w:p>
@@ -2435,13 +2387,26 @@
     </w:p>
     <w:p>
       <w:r>
-        <w:t>A mikrokontroller kiválasztása során figyelembe kellett vennem az analó</w:t>
+        <w:t xml:space="preserve">A mikrokontroller kiválasztása során figyelembe kellett vennem az </w:t>
+      </w:r>
+      <w:proofErr w:type="gramStart"/>
+      <w:r>
+        <w:t>analó</w:t>
       </w:r>
       <w:r>
         <w:t>g</w:t>
       </w:r>
-      <w:r>
-        <w:t xml:space="preserve"> illetve digitális bemenetek számát, az üzemi feszültséget, a mikrokontroller árát illetve használatának egyszerűségét</w:t>
+      <w:proofErr w:type="gramEnd"/>
+      <w:r>
+        <w:t xml:space="preserve"> illetve digitális bemenetek számát, az üzemi feszültséget, a mikrokontroller </w:t>
+      </w:r>
+      <w:proofErr w:type="gramStart"/>
+      <w:r>
+        <w:t>árát</w:t>
+      </w:r>
+      <w:proofErr w:type="gramEnd"/>
+      <w:r>
+        <w:t xml:space="preserve"> illetve használatának egyszerűségét</w:t>
       </w:r>
       <w:r>
         <w:t xml:space="preserve"> és korábbi tapasztalatot a használatával</w:t>
@@ -2549,46 +2514,13 @@
       </w:r>
       <w:proofErr w:type="spellEnd"/>
       <w:r>
-        <w:t xml:space="preserve"> adatbázis áll. Megtervezésénél hangsúlyos volt a táblák normalizálása. Az adatbázis 4 tábla teszi ki, ezek a következőek: </w:t>
-      </w:r>
-      <w:proofErr w:type="spellStart"/>
-      <w:r>
-        <w:t>plants_data</w:t>
-      </w:r>
-      <w:proofErr w:type="spellEnd"/>
-      <w:r>
-        <w:t xml:space="preserve">, </w:t>
-      </w:r>
-      <w:proofErr w:type="spellStart"/>
-      <w:r>
-        <w:t>users</w:t>
-      </w:r>
-      <w:proofErr w:type="spellEnd"/>
-      <w:r>
-        <w:t xml:space="preserve">, </w:t>
-      </w:r>
-      <w:proofErr w:type="spellStart"/>
-      <w:r>
-        <w:t>current_plants</w:t>
-      </w:r>
-      <w:proofErr w:type="spellEnd"/>
-      <w:r>
-        <w:t xml:space="preserve"> és </w:t>
-      </w:r>
-      <w:proofErr w:type="spellStart"/>
-      <w:r>
-        <w:t>weekly_data</w:t>
-      </w:r>
-      <w:proofErr w:type="spellEnd"/>
-      <w:r>
-        <w:t>. Vegyük őket részletesebben szemre.</w:t>
+        <w:t xml:space="preserve"> adatbázis áll. Megtervezésénél hangsúlyos volt a táblák normalizálása. Az adatbázis 4 tábla teszi ki, ezek a következőek: plants_data, users, current_plants és weekly_data. Vegyük őket részletesebben szemre.</w:t>
       </w:r>
     </w:p>
     <w:p>
       <w:r>
         <w:t xml:space="preserve">A </w:t>
       </w:r>
-      <w:proofErr w:type="spellStart"/>
       <w:r>
         <w:rPr>
           <w:b/>
@@ -2596,28 +2528,41 @@
         </w:rPr>
         <w:t>plants_data</w:t>
       </w:r>
+      <w:r>
+        <w:t xml:space="preserve"> tábla tartalmazza a lehetségesen megfigyelhető növények listáját, hétköznapi és </w:t>
+      </w:r>
+      <w:proofErr w:type="gramStart"/>
+      <w:r>
+        <w:t>tudományos  nevükkel</w:t>
+      </w:r>
+      <w:proofErr w:type="gramEnd"/>
+      <w:r>
+        <w:t>, valamint a</w:t>
+      </w:r>
+      <w:r>
+        <w:t xml:space="preserve">z egészséges növekedésükhöz szükséges ideális paraméterekkel. Ezek a paraméterek a következők: maximum, illetve minimum talajnedvesség szint, fény intenzitás, napi fény mennyiség, hőmérséklet és páratartalom. Az ideális körülmények meghatározása érdekében minden növény esetén külön kutatást végeztem. Elsősorban a New York Times </w:t>
+      </w:r>
+      <w:proofErr w:type="spellStart"/>
+      <w:r>
+        <w:t>Botanical</w:t>
+      </w:r>
       <w:proofErr w:type="spellEnd"/>
       <w:r>
-        <w:t xml:space="preserve"> tábla tartalmazza a lehetségesen megfigyelhető növények listáját, hétköznapi és tudományos  nevükkel, valamint a</w:t>
-      </w:r>
-      <w:r>
-        <w:t xml:space="preserve">z egészséges növekedésükhöz szükséges ideális paraméterekkel. Ezek a paraméterek a következők: maximum, illetve minimum talajnedvesség szint, fény intenzitás, napi fény mennyiség, hőmérséklet és páratartalom. Az ideális körülmények meghatározása érdekében minden növény esetén külön kutatást végeztem. Elsősorban a New York Times </w:t>
+        <w:t xml:space="preserve"> </w:t>
       </w:r>
       <w:proofErr w:type="spellStart"/>
       <w:r>
-        <w:t>Botanical</w:t>
+        <w:t>Garden</w:t>
       </w:r>
       <w:proofErr w:type="spellEnd"/>
       <w:r>
-        <w:t xml:space="preserve"> </w:t>
-      </w:r>
-      <w:proofErr w:type="spellStart"/>
-      <w:r>
-        <w:t>Garden</w:t>
-      </w:r>
-      <w:proofErr w:type="spellEnd"/>
-      <w:r>
-        <w:t xml:space="preserve"> oldalát vettem alapul. A legtöbb növényhez viszont a hőmérséklet és páratartalom kivételével nehéz konkrétumokat találni, ezért ezeknél a paramétereknél külön kategóriákat határoztam meg a hozzávetőleges szükségletekből kiindulva. A napi fény mennyiségét 4 kategóriába soroltam: </w:t>
+        <w:t xml:space="preserve"> oldalát vettem alapul. A legtöbb növényhez viszont a hőmérséklet és páratartalom kivételével nehéz konkrétumokat találni, ezért ezeknél a paramétereknél külön kategóriákat határoztam meg a hozzávetőleges szükségletekből kiindulva.</w:t>
+      </w:r>
+      <w:r>
+        <w:t xml:space="preserve"> Fontos itt megjegyezni, hogy egy növény esetlegesen több kategóriába is beleeshet, például részben árnyék kedvelő, de kevesebb fénnyel is beéri.</w:t>
+      </w:r>
+      <w:r>
+        <w:t xml:space="preserve"> A napi fény mennyiségét 4 kategóriába soroltam: </w:t>
       </w:r>
       <w:hyperlink r:id="rId36" w:history="1">
         <w:r>
@@ -2861,6 +2806,7 @@
           </w:tcPr>
           <w:p>
             <w:r>
+              <w:lastRenderedPageBreak/>
               <w:t>Száraz</w:t>
             </w:r>
           </w:p>
@@ -2913,7 +2859,6 @@
           </w:tcPr>
           <w:p>
             <w:r>
-              <w:lastRenderedPageBreak/>
               <w:t>0-200</w:t>
             </w:r>
           </w:p>
@@ -2963,14 +2908,21 @@
     <w:p/>
     <w:p>
       <w:r>
-        <w:t>Ebben a táblában a növény hétköznapi neve funkcionál elsődleges kulcsként, ezért egyedinek is kell lennie, ezzel megakadályozva hogy ugyanahhoz a növényhez egymást kontradiktáló adatok legyenek feljegyezve. Ez az egyetlen tábla, amit az applikáción keresztül a felhasználó nem tud módosítani.</w:t>
+        <w:t xml:space="preserve">Ebben a táblában a növény hétköznapi neve funkcionál elsődleges kulcsként, ezért egyedinek is kell lennie, ezzel </w:t>
+      </w:r>
+      <w:proofErr w:type="gramStart"/>
+      <w:r>
+        <w:t>megakadályozva</w:t>
+      </w:r>
+      <w:proofErr w:type="gramEnd"/>
+      <w:r>
+        <w:t xml:space="preserve"> hogy ugyanahhoz a növényhez egymást kontradiktáló adatok legyenek feljegyezve. Ez az egyetlen tábla, amit az applikáción keresztül a felhasználó nem tud módosítani.</w:t>
       </w:r>
     </w:p>
     <w:p>
       <w:r>
         <w:t xml:space="preserve">A következő tábla, amit megnézünk a </w:t>
       </w:r>
-      <w:proofErr w:type="spellStart"/>
       <w:r>
         <w:rPr>
           <w:b/>
@@ -2978,7 +2930,6 @@
         </w:rPr>
         <w:t>users</w:t>
       </w:r>
-      <w:proofErr w:type="spellEnd"/>
       <w:r>
         <w:rPr>
           <w:b/>
@@ -3009,38 +2960,13 @@
         <w:t>helyet kapott</w:t>
       </w:r>
       <w:r>
-        <w:t xml:space="preserve"> egy egyedi azonosító (</w:t>
-      </w:r>
-      <w:proofErr w:type="spellStart"/>
-      <w:r>
-        <w:t>id</w:t>
-      </w:r>
-      <w:proofErr w:type="spellEnd"/>
-      <w:r>
-        <w:t>), a felhasználó neve (</w:t>
-      </w:r>
-      <w:proofErr w:type="spellStart"/>
-      <w:r>
-        <w:t>name</w:t>
-      </w:r>
-      <w:proofErr w:type="spellEnd"/>
-      <w:r>
-        <w:t>, az azonosító lehetővé teszi, hogy több felhasználó ugyanazon a néven fusson) és egy jelszó mező (</w:t>
-      </w:r>
-      <w:proofErr w:type="spellStart"/>
-      <w:r>
-        <w:t>password</w:t>
-      </w:r>
-      <w:proofErr w:type="spellEnd"/>
-      <w:r>
-        <w:t>) amely titkosítva tárolja a felhasználók jelszavát. Ennek a táblának a módosításához nem szükséges különleges hozzáférés, bárki adhat hozzá új felhasználót. A felhasználók törlése viszont csak a bejelentkezés után lehetséges. A felhasználók így csak a saját „fiókjukat” törölhetik, ezzel törölve minden hozzájuk tartozó adatot is a többi táblából.</w:t>
+        <w:t xml:space="preserve"> egy egyedi azonosító (id), a felhasználó neve (name, az azonosító lehetővé teszi, hogy több felhasználó ugyanazon a néven fusson) és egy jelszó mező (password) amely titkosítva tárolja a felhasználók jelszavát. Ennek a táblának a módosításához nem szükséges különleges hozzáférés, bárki adhat hozzá új felhasználót. A felhasználók törlése viszont csak a bejelentkezés után lehetséges. A felhasználók így csak a saját „fiókjukat” törölhetik, ezzel törölve minden hozzájuk tartozó adatot is a többi táblából.</w:t>
       </w:r>
     </w:p>
     <w:p>
       <w:r>
         <w:t xml:space="preserve">A következő tábla, amiről szót kell ejtenünk, az a </w:t>
       </w:r>
-      <w:proofErr w:type="spellStart"/>
       <w:r>
         <w:rPr>
           <w:b/>
@@ -3048,73 +2974,32 @@
         </w:rPr>
         <w:t>current_plants</w:t>
       </w:r>
+      <w:r>
+        <w:t xml:space="preserve"> tábla. Ebben a táblában gyűjtjük össze, hogy éppen milyen növények vannak valamilyen felhasználóhoz rendelve. A tábla és az adatbázis lehetővé tesz egyszerre több felhasználóhoz tartozó akár több növény tárolását is. Ennek érdekében a tábla tartalmaz egy egyedi azonosítót (id), ami egyértelműen azonosítja a növényt (ez később a mért adatok eltárolásánál lesz fontos), a növény hétköznapi nevét (ez a mező kapcsolja össze a plants_data táblával, így tudjuk lekérdezni az adott növény szükségleteinek kielégítéséhez szükséges adatokat) és egy user_id mezőt, ami segít meghatározni, hogy melyik növény melyik felhasználóhoz tartozik.</w:t>
+      </w:r>
+    </w:p>
+    <w:p>
+      <w:r>
+        <w:t>Az utolsó tábla az adatbázisban a weekly_data. A nevet azért kapta, mert csak a</w:t>
+      </w:r>
+      <w:r>
+        <w:t xml:space="preserve"> legutóbbi 7 nap adatait tárolja el, az ennél </w:t>
+      </w:r>
+      <w:proofErr w:type="spellStart"/>
+      <w:r>
+        <w:t>régebbieket</w:t>
+      </w:r>
       <w:proofErr w:type="spellEnd"/>
       <w:r>
-        <w:t xml:space="preserve"> tábla. Ebben a táblában gyűjtjük össze, hogy éppen milyen növények vannak valamilyen felhasználóhoz rendelve. A tábla és az adatbázis lehetővé tesz egyszerre több felhasználóhoz tartozó akár több növény tárolását is. Ennek érdekében a tábla tartalmaz egy egyedi azonosítót (</w:t>
+        <w:t xml:space="preserve"> automatikusan törli új adat felölésekor. Ez a tábla tartalmazza az </w:t>
       </w:r>
       <w:proofErr w:type="spellStart"/>
       <w:r>
-        <w:t>id</w:t>
+        <w:t>arduino</w:t>
       </w:r>
       <w:proofErr w:type="spellEnd"/>
       <w:r>
-        <w:t xml:space="preserve">), ami egyértelműen azonosítja a növényt (ez később a mért adatok eltárolásánál lesz fontos), a növény hétköznapi nevét (ez a mező kapcsolja össze a </w:t>
-      </w:r>
-      <w:proofErr w:type="spellStart"/>
-      <w:r>
-        <w:t>plants_data</w:t>
-      </w:r>
-      <w:proofErr w:type="spellEnd"/>
-      <w:r>
-        <w:t xml:space="preserve"> táblával, így tudjuk lekérdezni az adott növény szükségleteinek kielégítéséhez szükséges adatokat) és egy </w:t>
-      </w:r>
-      <w:proofErr w:type="spellStart"/>
-      <w:r>
-        <w:t>user_id</w:t>
-      </w:r>
-      <w:proofErr w:type="spellEnd"/>
-      <w:r>
-        <w:t xml:space="preserve"> mezőt, ami segít meghatározni, hogy melyik növény melyik felhasználóhoz tartozik.</w:t>
-      </w:r>
-    </w:p>
-    <w:p>
-      <w:r>
-        <w:t xml:space="preserve">Az utolsó tábla az adatbázisban a </w:t>
-      </w:r>
-      <w:proofErr w:type="spellStart"/>
-      <w:r>
-        <w:t>weekly_data</w:t>
-      </w:r>
-      <w:proofErr w:type="spellEnd"/>
-      <w:r>
-        <w:t>. A nevet azért kapta, mert csak a</w:t>
-      </w:r>
-      <w:r>
-        <w:t xml:space="preserve"> legutóbbi 7 nap adatait tárolja el, az ennél </w:t>
-      </w:r>
-      <w:proofErr w:type="spellStart"/>
-      <w:r>
-        <w:t>régebbieket</w:t>
-      </w:r>
-      <w:proofErr w:type="spellEnd"/>
-      <w:r>
-        <w:t xml:space="preserve"> automatikusan törli új adat felölésekor. Ez a tábla tartalmazza az </w:t>
-      </w:r>
-      <w:proofErr w:type="spellStart"/>
-      <w:r>
-        <w:t>arduino</w:t>
-      </w:r>
-      <w:proofErr w:type="spellEnd"/>
-      <w:r>
-        <w:t xml:space="preserve"> által mért adatokat, amiket az 15 percenként küldd el a webszervernek. Ezeket az adatokat a </w:t>
-      </w:r>
-      <w:proofErr w:type="spellStart"/>
-      <w:r>
-        <w:t>current_plant_id</w:t>
-      </w:r>
-      <w:proofErr w:type="spellEnd"/>
-      <w:r>
-        <w:t xml:space="preserve"> mező segítségével rendeli egy adott növényhez.</w:t>
+        <w:t xml:space="preserve"> által mért adatokat, amiket az 15 percenként küldd el a webszervernek. Ezeket az adatokat a current_plant_id mező segítségével rendeli egy adott növényhez.</w:t>
       </w:r>
     </w:p>
     <w:p/>
@@ -3180,53 +3065,14 @@
           <w:szCs w:val="24"/>
         </w:rPr>
       </w:pPr>
-      <w:r>
-        <w:rPr>
-          <w:rFonts w:ascii="Times New Roman" w:hAnsi="Times New Roman" w:cs="Times New Roman"/>
-          <w:sz w:val="24"/>
-          <w:szCs w:val="24"/>
-        </w:rPr>
-        <w:t xml:space="preserve">A </w:t>
-      </w:r>
-      <w:r>
-        <w:rPr>
-          <w:rFonts w:ascii="Times New Roman" w:hAnsi="Times New Roman" w:cs="Times New Roman"/>
-          <w:sz w:val="24"/>
-          <w:szCs w:val="24"/>
-        </w:rPr>
-        <w:t>növénygondozás</w:t>
-      </w:r>
-      <w:r>
-        <w:rPr>
-          <w:rFonts w:ascii="Times New Roman" w:hAnsi="Times New Roman" w:cs="Times New Roman"/>
-          <w:sz w:val="24"/>
-          <w:szCs w:val="24"/>
-        </w:rPr>
-        <w:t xml:space="preserve"> problémája sokakat foglalkoztat, ebből kifolyólag annak</w:t>
-      </w:r>
-      <w:r>
-        <w:rPr>
-          <w:rFonts w:ascii="Times New Roman" w:hAnsi="Times New Roman" w:cs="Times New Roman"/>
-          <w:sz w:val="24"/>
-          <w:szCs w:val="24"/>
-        </w:rPr>
-        <w:t xml:space="preserve"> megkönnyebbítésének valamilyen formájú megvalósítás</w:t>
-      </w:r>
-      <w:r>
-        <w:rPr>
-          <w:rFonts w:ascii="Times New Roman" w:hAnsi="Times New Roman" w:cs="Times New Roman"/>
-          <w:sz w:val="24"/>
-          <w:szCs w:val="24"/>
-        </w:rPr>
-        <w:t>ával már többen is próbálkoztak</w:t>
-      </w:r>
-      <w:r>
-        <w:rPr>
-          <w:rFonts w:ascii="Times New Roman" w:hAnsi="Times New Roman" w:cs="Times New Roman"/>
-          <w:sz w:val="24"/>
-          <w:szCs w:val="24"/>
-        </w:rPr>
-        <w:t>.</w:t>
+      <w:bookmarkStart w:id="0" w:name="_Hlk218364781"/>
+      <w:r>
+        <w:rPr>
+          <w:rFonts w:ascii="Times New Roman" w:hAnsi="Times New Roman" w:cs="Times New Roman"/>
+          <w:sz w:val="24"/>
+          <w:szCs w:val="24"/>
+        </w:rPr>
+        <w:t>A növénygondozás problémája sokakat foglalkoztat, ebből kifolyólag annak megkönnyebbítésének valamilyen formájú megvalósításával már többen is próbálkoztak.</w:t>
       </w:r>
       <w:r>
         <w:rPr>
@@ -3247,24 +3093,8 @@
           <w:szCs w:val="24"/>
         </w:rPr>
       </w:pPr>
-    </w:p>
-    <w:p>
-      <w:pPr>
-        <w:jc w:val="both"/>
-        <w:rPr>
-          <w:rFonts w:ascii="Times New Roman" w:hAnsi="Times New Roman" w:cs="Times New Roman"/>
-          <w:sz w:val="24"/>
-          <w:szCs w:val="24"/>
-        </w:rPr>
-      </w:pPr>
-      <w:r>
-        <w:rPr>
-          <w:rFonts w:ascii="Times New Roman" w:hAnsi="Times New Roman" w:cs="Times New Roman"/>
-          <w:sz w:val="24"/>
-          <w:szCs w:val="24"/>
-        </w:rPr>
-        <w:t xml:space="preserve">IVY </w:t>
-      </w:r>
+      <w:bookmarkStart w:id="1" w:name="_Hlk218452396"/>
+      <w:bookmarkEnd w:id="0"/>
       <w:proofErr w:type="spellStart"/>
       <w:r>
         <w:rPr>
@@ -3290,9 +3120,53 @@
           <w:sz w:val="24"/>
           <w:szCs w:val="24"/>
         </w:rPr>
-        <w:t>Planter</w:t>
+        <w:t>pot</w:t>
       </w:r>
       <w:proofErr w:type="spellEnd"/>
+      <w:r>
+        <w:rPr>
+          <w:rFonts w:ascii="Times New Roman" w:hAnsi="Times New Roman" w:cs="Times New Roman"/>
+          <w:sz w:val="24"/>
+          <w:szCs w:val="24"/>
+        </w:rPr>
+        <w:t xml:space="preserve"> – </w:t>
+      </w:r>
+      <w:proofErr w:type="spellStart"/>
+      <w:r>
+        <w:rPr>
+          <w:rFonts w:ascii="Times New Roman" w:hAnsi="Times New Roman" w:cs="Times New Roman"/>
+          <w:sz w:val="24"/>
+          <w:szCs w:val="24"/>
+        </w:rPr>
+        <w:t>Smart</w:t>
+      </w:r>
+      <w:proofErr w:type="spellEnd"/>
+      <w:r>
+        <w:rPr>
+          <w:rFonts w:ascii="Times New Roman" w:hAnsi="Times New Roman" w:cs="Times New Roman"/>
+          <w:sz w:val="24"/>
+          <w:szCs w:val="24"/>
+        </w:rPr>
+        <w:t xml:space="preserve"> </w:t>
+      </w:r>
+      <w:proofErr w:type="spellStart"/>
+      <w:r>
+        <w:rPr>
+          <w:rFonts w:ascii="Times New Roman" w:hAnsi="Times New Roman" w:cs="Times New Roman"/>
+          <w:sz w:val="24"/>
+          <w:szCs w:val="24"/>
+        </w:rPr>
+        <w:t>Garden</w:t>
+      </w:r>
+      <w:proofErr w:type="spellEnd"/>
+      <w:r>
+        <w:rPr>
+          <w:rFonts w:ascii="Times New Roman" w:hAnsi="Times New Roman" w:cs="Times New Roman"/>
+          <w:sz w:val="24"/>
+          <w:szCs w:val="24"/>
+        </w:rPr>
+        <w:t xml:space="preserve"> készlet</w:t>
+      </w:r>
     </w:p>
     <w:p>
       <w:pPr>
@@ -3305,6 +3179,190 @@
           <w:szCs w:val="24"/>
         </w:rPr>
       </w:pPr>
+      <w:bookmarkStart w:id="2" w:name="_Hlk218452432"/>
+      <w:bookmarkEnd w:id="1"/>
+      <w:r>
+        <w:rPr>
+          <w:rFonts w:ascii="Times New Roman" w:hAnsi="Times New Roman" w:cs="Times New Roman"/>
+          <w:sz w:val="24"/>
+          <w:szCs w:val="24"/>
+        </w:rPr>
+        <w:t>Ez az okos cserép elsősorban fűszernövények növesztésére készült. Rendelkezik egy víztartállyal és egy, akár automata módon fel-le kapcsolható LED lámpával, ami garantálja a növény fényigényének kielégítését. A tartály vízszintjének 10%-</w:t>
+      </w:r>
+      <w:proofErr w:type="spellStart"/>
+      <w:r>
+        <w:rPr>
+          <w:rFonts w:ascii="Times New Roman" w:hAnsi="Times New Roman" w:cs="Times New Roman"/>
+          <w:sz w:val="24"/>
+          <w:szCs w:val="24"/>
+        </w:rPr>
+        <w:t>ra</w:t>
+      </w:r>
+      <w:proofErr w:type="spellEnd"/>
+      <w:r>
+        <w:rPr>
+          <w:rFonts w:ascii="Times New Roman" w:hAnsi="Times New Roman" w:cs="Times New Roman"/>
+          <w:sz w:val="24"/>
+          <w:szCs w:val="24"/>
+        </w:rPr>
+        <w:t xml:space="preserve"> csökkenése esetén egy felvillanó lámpa figyelmezteti a felhasználót annak újra töltésére. Az ígért funkcióknak ugyan eleget tesz, hiányzik belőle a</w:t>
+      </w:r>
+      <w:r>
+        <w:rPr>
+          <w:rFonts w:ascii="Times New Roman" w:hAnsi="Times New Roman" w:cs="Times New Roman"/>
+          <w:sz w:val="24"/>
+          <w:szCs w:val="24"/>
+        </w:rPr>
+        <w:t xml:space="preserve"> növény környezetének</w:t>
+      </w:r>
+      <w:r>
+        <w:rPr>
+          <w:rFonts w:ascii="Times New Roman" w:hAnsi="Times New Roman" w:cs="Times New Roman"/>
+          <w:sz w:val="24"/>
+          <w:szCs w:val="24"/>
+        </w:rPr>
+        <w:t xml:space="preserve"> precíz </w:t>
+      </w:r>
+      <w:r>
+        <w:rPr>
+          <w:rFonts w:ascii="Times New Roman" w:hAnsi="Times New Roman" w:cs="Times New Roman"/>
+          <w:sz w:val="24"/>
+          <w:szCs w:val="24"/>
+        </w:rPr>
+        <w:t xml:space="preserve">megfigyelése, így állapotának pontos meghatározása is, ami gondot jelenthet, ha kényesebb szobanövényeket szeretnénk felnevelni a segítségével. </w:t>
+      </w:r>
+      <w:bookmarkEnd w:id="2"/>
+      <w:r>
+        <w:rPr>
+          <w:rFonts w:ascii="Times New Roman" w:hAnsi="Times New Roman" w:cs="Times New Roman"/>
+          <w:sz w:val="24"/>
+          <w:szCs w:val="24"/>
+        </w:rPr>
+        <w:fldChar w:fldCharType="begin"/>
+      </w:r>
+      <w:r>
+        <w:rPr>
+          <w:rFonts w:ascii="Times New Roman" w:hAnsi="Times New Roman" w:cs="Times New Roman"/>
+          <w:sz w:val="24"/>
+          <w:szCs w:val="24"/>
+        </w:rPr>
+        <w:instrText>HYPERLINK "</w:instrText>
+      </w:r>
+      <w:r>
+        <w:rPr>
+          <w:rFonts w:ascii="Times New Roman" w:hAnsi="Times New Roman" w:cs="Times New Roman"/>
+          <w:sz w:val="24"/>
+          <w:szCs w:val="24"/>
+        </w:rPr>
+        <w:instrText>https://www.ledgrow.hu/smart-pot-smart-garden-keszlet/</w:instrText>
+      </w:r>
+      <w:r>
+        <w:rPr>
+          <w:rFonts w:ascii="Times New Roman" w:hAnsi="Times New Roman" w:cs="Times New Roman"/>
+          <w:sz w:val="24"/>
+          <w:szCs w:val="24"/>
+        </w:rPr>
+        <w:instrText>"</w:instrText>
+      </w:r>
+      <w:r>
+        <w:rPr>
+          <w:rFonts w:ascii="Times New Roman" w:hAnsi="Times New Roman" w:cs="Times New Roman"/>
+          <w:sz w:val="24"/>
+          <w:szCs w:val="24"/>
+        </w:rPr>
+      </w:r>
+      <w:r>
+        <w:rPr>
+          <w:rFonts w:ascii="Times New Roman" w:hAnsi="Times New Roman" w:cs="Times New Roman"/>
+          <w:sz w:val="24"/>
+          <w:szCs w:val="24"/>
+        </w:rPr>
+        <w:fldChar w:fldCharType="separate"/>
+      </w:r>
+      <w:r>
+        <w:rPr>
+          <w:rStyle w:val="Hiperhivatkozs"/>
+          <w:rFonts w:ascii="Times New Roman" w:hAnsi="Times New Roman" w:cs="Times New Roman"/>
+          <w:sz w:val="24"/>
+          <w:szCs w:val="24"/>
+        </w:rPr>
+        <w:t>https://www.ledgrow.hu/smart-pot-smart-garden-keszlet/</w:t>
+      </w:r>
+      <w:r>
+        <w:rPr>
+          <w:rFonts w:ascii="Times New Roman" w:hAnsi="Times New Roman" w:cs="Times New Roman"/>
+          <w:sz w:val="24"/>
+          <w:szCs w:val="24"/>
+        </w:rPr>
+        <w:fldChar w:fldCharType="end"/>
+      </w:r>
+      <w:r>
+        <w:rPr>
+          <w:rFonts w:ascii="Times New Roman" w:hAnsi="Times New Roman" w:cs="Times New Roman"/>
+          <w:sz w:val="24"/>
+          <w:szCs w:val="24"/>
+        </w:rPr>
+        <w:t xml:space="preserve"> </w:t>
+      </w:r>
+    </w:p>
+    <w:p>
+      <w:pPr>
+        <w:jc w:val="both"/>
+        <w:rPr>
+          <w:rFonts w:ascii="Times New Roman" w:hAnsi="Times New Roman" w:cs="Times New Roman"/>
+          <w:sz w:val="24"/>
+          <w:szCs w:val="24"/>
+        </w:rPr>
+      </w:pPr>
+      <w:r>
+        <w:rPr>
+          <w:rFonts w:ascii="Times New Roman" w:hAnsi="Times New Roman" w:cs="Times New Roman"/>
+          <w:sz w:val="24"/>
+          <w:szCs w:val="24"/>
+        </w:rPr>
+        <w:t xml:space="preserve">IVY </w:t>
+      </w:r>
+      <w:proofErr w:type="spellStart"/>
+      <w:r>
+        <w:rPr>
+          <w:rFonts w:ascii="Times New Roman" w:hAnsi="Times New Roman" w:cs="Times New Roman"/>
+          <w:sz w:val="24"/>
+          <w:szCs w:val="24"/>
+        </w:rPr>
+        <w:t>Smart</w:t>
+      </w:r>
+      <w:proofErr w:type="spellEnd"/>
+      <w:r>
+        <w:rPr>
+          <w:rFonts w:ascii="Times New Roman" w:hAnsi="Times New Roman" w:cs="Times New Roman"/>
+          <w:sz w:val="24"/>
+          <w:szCs w:val="24"/>
+        </w:rPr>
+        <w:t xml:space="preserve"> </w:t>
+      </w:r>
+      <w:proofErr w:type="spellStart"/>
+      <w:r>
+        <w:rPr>
+          <w:rFonts w:ascii="Times New Roman" w:hAnsi="Times New Roman" w:cs="Times New Roman"/>
+          <w:sz w:val="24"/>
+          <w:szCs w:val="24"/>
+        </w:rPr>
+        <w:t>Planter</w:t>
+      </w:r>
+      <w:proofErr w:type="spellEnd"/>
+    </w:p>
+    <w:p>
+      <w:pPr>
+        <w:spacing w:line="360" w:lineRule="auto"/>
+        <w:ind w:firstLine="426"/>
+        <w:jc w:val="both"/>
+        <w:rPr>
+          <w:rFonts w:ascii="Times New Roman" w:hAnsi="Times New Roman" w:cs="Times New Roman"/>
+          <w:sz w:val="24"/>
+          <w:szCs w:val="24"/>
+        </w:rPr>
+      </w:pPr>
+      <w:bookmarkStart w:id="3" w:name="_Hlk218364758"/>
       <w:r>
         <w:rPr>
           <w:rFonts w:ascii="Times New Roman" w:hAnsi="Times New Roman" w:cs="Times New Roman"/>
@@ -3445,14 +3503,6 @@
           <w:sz w:val="24"/>
           <w:szCs w:val="24"/>
         </w:rPr>
-        <w:t xml:space="preserve"> A cserép által megfigyelt paraméterek a következők: relatív hőmérséklet, illetve páratartalom, víztartály szintje és a növényt érő fény intenzitása.</w:t>
-      </w:r>
-      <w:r>
-        <w:rPr>
-          <w:rFonts w:ascii="Times New Roman" w:hAnsi="Times New Roman" w:cs="Times New Roman"/>
-          <w:sz w:val="24"/>
-          <w:szCs w:val="24"/>
-        </w:rPr>
         <w:t xml:space="preserve"> </w:t>
       </w:r>
       <w:r>
@@ -3461,6 +3511,55 @@
           <w:sz w:val="24"/>
           <w:szCs w:val="24"/>
         </w:rPr>
+        <w:t>Az ebben a fejezetben bemutatott megvalósítások közül messze ez a legnépszerűbb</w:t>
+      </w:r>
+      <w:r>
+        <w:rPr>
+          <w:rFonts w:ascii="Times New Roman" w:hAnsi="Times New Roman" w:cs="Times New Roman"/>
+          <w:sz w:val="24"/>
+          <w:szCs w:val="24"/>
+        </w:rPr>
+        <w:t xml:space="preserve"> és </w:t>
+      </w:r>
+      <w:r>
+        <w:rPr>
+          <w:rFonts w:ascii="Times New Roman" w:hAnsi="Times New Roman" w:cs="Times New Roman"/>
+          <w:sz w:val="24"/>
+          <w:szCs w:val="24"/>
+        </w:rPr>
+        <w:lastRenderedPageBreak/>
+        <w:t>látszólag a leghatékonyabb</w:t>
+      </w:r>
+      <w:r>
+        <w:rPr>
+          <w:rFonts w:ascii="Times New Roman" w:hAnsi="Times New Roman" w:cs="Times New Roman"/>
+          <w:sz w:val="24"/>
+          <w:szCs w:val="24"/>
+        </w:rPr>
+        <w:t xml:space="preserve">. </w:t>
+      </w:r>
+      <w:r>
+        <w:rPr>
+          <w:rFonts w:ascii="Times New Roman" w:hAnsi="Times New Roman" w:cs="Times New Roman"/>
+          <w:sz w:val="24"/>
+          <w:szCs w:val="24"/>
+        </w:rPr>
+        <w:t>A cserép által megfigyelt paraméterek a következők: relatív hőmérséklet, illetve páratartalom, víztartály szintje és a növényt érő fény intenzitása.</w:t>
+      </w:r>
+      <w:r>
+        <w:rPr>
+          <w:rFonts w:ascii="Times New Roman" w:hAnsi="Times New Roman" w:cs="Times New Roman"/>
+          <w:sz w:val="24"/>
+          <w:szCs w:val="24"/>
+        </w:rPr>
+        <w:t xml:space="preserve"> </w:t>
+      </w:r>
+      <w:r>
+        <w:rPr>
+          <w:rFonts w:ascii="Times New Roman" w:hAnsi="Times New Roman" w:cs="Times New Roman"/>
+          <w:sz w:val="24"/>
+          <w:szCs w:val="24"/>
+        </w:rPr>
         <w:t>Az okos cseréphez tartozik</w:t>
       </w:r>
       <w:r>
@@ -3511,16 +3610,7 @@
           <w:sz w:val="24"/>
           <w:szCs w:val="24"/>
         </w:rPr>
-        <w:t xml:space="preserve"> okos cserép pontatlanul méri a talaj nedvességszintjét, többen is panaszt tettek, amiért az automatikus </w:t>
-      </w:r>
-      <w:r>
-        <w:rPr>
-          <w:rFonts w:ascii="Times New Roman" w:hAnsi="Times New Roman" w:cs="Times New Roman"/>
-          <w:sz w:val="24"/>
-          <w:szCs w:val="24"/>
-        </w:rPr>
-        <w:lastRenderedPageBreak/>
-        <w:t>öntözés túlzó gyakorisá</w:t>
+        <w:t xml:space="preserve"> okos cserép pontatlanul méri a talaj nedvességszintjét, többen is panaszt tettek, amiért az automatikus öntözés túlzó gyakorisá</w:t>
       </w:r>
       <w:r>
         <w:rPr>
@@ -3598,13 +3688,14 @@
         </w:rPr>
         <w:t>.</w:t>
       </w:r>
-      <w:r>
-        <w:rPr>
-          <w:rFonts w:ascii="Times New Roman" w:hAnsi="Times New Roman" w:cs="Times New Roman"/>
-          <w:sz w:val="24"/>
-          <w:szCs w:val="24"/>
-        </w:rPr>
-        <w:br/>
+      <w:bookmarkEnd w:id="3"/>
+      <w:r>
+        <w:rPr>
+          <w:rFonts w:ascii="Times New Roman" w:hAnsi="Times New Roman" w:cs="Times New Roman"/>
+          <w:sz w:val="24"/>
+          <w:szCs w:val="24"/>
+        </w:rPr>
+        <w:t xml:space="preserve"> </w:t>
       </w:r>
       <w:hyperlink r:id="rId39" w:history="1">
         <w:r>
@@ -3629,6 +3720,181 @@
     <w:p>
       <w:pPr>
         <w:spacing w:line="360" w:lineRule="auto"/>
+        <w:jc w:val="both"/>
+        <w:rPr>
+          <w:rFonts w:ascii="Times New Roman" w:hAnsi="Times New Roman" w:cs="Times New Roman"/>
+          <w:sz w:val="24"/>
+          <w:szCs w:val="24"/>
+        </w:rPr>
+      </w:pPr>
+      <w:proofErr w:type="spellStart"/>
+      <w:r>
+        <w:rPr>
+          <w:rFonts w:ascii="Times New Roman" w:hAnsi="Times New Roman" w:cs="Times New Roman"/>
+          <w:sz w:val="24"/>
+          <w:szCs w:val="24"/>
+        </w:rPr>
+        <w:t>Flaura</w:t>
+      </w:r>
+      <w:proofErr w:type="spellEnd"/>
+    </w:p>
+    <w:p>
+      <w:pPr>
+        <w:spacing w:line="360" w:lineRule="auto"/>
+        <w:ind w:firstLine="426"/>
+        <w:jc w:val="both"/>
+        <w:rPr>
+          <w:rFonts w:ascii="Times New Roman" w:hAnsi="Times New Roman" w:cs="Times New Roman"/>
+          <w:sz w:val="24"/>
+          <w:szCs w:val="24"/>
+        </w:rPr>
+      </w:pPr>
+      <w:bookmarkStart w:id="4" w:name="_Hlk218452843"/>
+      <w:r>
+        <w:rPr>
+          <w:rFonts w:ascii="Times New Roman" w:hAnsi="Times New Roman" w:cs="Times New Roman"/>
+          <w:sz w:val="24"/>
+          <w:szCs w:val="24"/>
+        </w:rPr>
+        <w:t xml:space="preserve">A </w:t>
+      </w:r>
+      <w:proofErr w:type="spellStart"/>
+      <w:r>
+        <w:rPr>
+          <w:rFonts w:ascii="Times New Roman" w:hAnsi="Times New Roman" w:cs="Times New Roman"/>
+          <w:sz w:val="24"/>
+          <w:szCs w:val="24"/>
+        </w:rPr>
+        <w:t>Flaura</w:t>
+      </w:r>
+      <w:proofErr w:type="spellEnd"/>
+      <w:r>
+        <w:rPr>
+          <w:rFonts w:ascii="Times New Roman" w:hAnsi="Times New Roman" w:cs="Times New Roman"/>
+          <w:sz w:val="24"/>
+          <w:szCs w:val="24"/>
+        </w:rPr>
+        <w:t xml:space="preserve"> okos virágcserép esetében egy </w:t>
+      </w:r>
+      <w:proofErr w:type="spellStart"/>
+      <w:r>
+        <w:rPr>
+          <w:rFonts w:ascii="Times New Roman" w:hAnsi="Times New Roman" w:cs="Times New Roman"/>
+          <w:sz w:val="24"/>
+          <w:szCs w:val="24"/>
+        </w:rPr>
+        <w:t>open</w:t>
+      </w:r>
+      <w:proofErr w:type="spellEnd"/>
+      <w:r>
+        <w:rPr>
+          <w:rFonts w:ascii="Times New Roman" w:hAnsi="Times New Roman" w:cs="Times New Roman"/>
+          <w:sz w:val="24"/>
+          <w:szCs w:val="24"/>
+        </w:rPr>
+        <w:t xml:space="preserve"> </w:t>
+      </w:r>
+      <w:proofErr w:type="spellStart"/>
+      <w:r>
+        <w:rPr>
+          <w:rFonts w:ascii="Times New Roman" w:hAnsi="Times New Roman" w:cs="Times New Roman"/>
+          <w:sz w:val="24"/>
+          <w:szCs w:val="24"/>
+        </w:rPr>
+        <w:t>source</w:t>
+      </w:r>
+      <w:proofErr w:type="spellEnd"/>
+      <w:r>
+        <w:rPr>
+          <w:rFonts w:ascii="Times New Roman" w:hAnsi="Times New Roman" w:cs="Times New Roman"/>
+          <w:sz w:val="24"/>
+          <w:szCs w:val="24"/>
+        </w:rPr>
+        <w:t xml:space="preserve"> projektről beszélünk, ami teljes mértékben egy ember munkája. Ennek a cserépnek az elkészítéséhez a tervező </w:t>
+      </w:r>
+      <w:proofErr w:type="spellStart"/>
+      <w:r>
+        <w:rPr>
+          <w:rFonts w:ascii="Times New Roman" w:hAnsi="Times New Roman" w:cs="Times New Roman"/>
+          <w:sz w:val="24"/>
+          <w:szCs w:val="24"/>
+        </w:rPr>
+        <w:t>youtube</w:t>
+      </w:r>
+      <w:proofErr w:type="spellEnd"/>
+      <w:r>
+        <w:rPr>
+          <w:rFonts w:ascii="Times New Roman" w:hAnsi="Times New Roman" w:cs="Times New Roman"/>
+          <w:sz w:val="24"/>
+          <w:szCs w:val="24"/>
+        </w:rPr>
+        <w:t xml:space="preserve"> csatornáján részletes útmutatót kapunk. A cserép két fő funkciót lát el, a növény talajnedvességszintjének folyamatos monitorozását és a növény automatikus locsolását</w:t>
+      </w:r>
+      <w:r>
+        <w:rPr>
+          <w:rFonts w:ascii="Times New Roman" w:hAnsi="Times New Roman" w:cs="Times New Roman"/>
+          <w:sz w:val="24"/>
+          <w:szCs w:val="24"/>
+        </w:rPr>
+        <w:t xml:space="preserve">. Emellett egy telefonos applikáció is megvalósításra került, ami tovább segíti a vizsgált növény vízszükségletének felmérését és annak kielégítését. Az applikációban beállítható az öntözés gyakorisága, ezentúl értesítést is küld a felhasználónak a víztartály kiürüléséről. A rendszert egy Arduino fogja össze, az elektronika magában a cserépben kap helyet, amit a fejlesztő kifejezetten ehhez a projekthez tervezett és 3d nyomtatott. Az automata öntözése ennél a cserépnél nem merül ki csupán egy újratölthető víztartályban, mint ahogy azt az előző két példában láthattuk. Itt </w:t>
+      </w:r>
+      <w:r>
+        <w:rPr>
+          <w:rFonts w:ascii="Times New Roman" w:hAnsi="Times New Roman" w:cs="Times New Roman"/>
+          <w:sz w:val="24"/>
+          <w:szCs w:val="24"/>
+        </w:rPr>
+        <w:t xml:space="preserve">a tartályból egy kis szivattyú műanyagcsöveken keresztül juttatja el a vizet a növényhez. Ez a megvalósítás ugyan a </w:t>
+      </w:r>
+      <w:proofErr w:type="spellStart"/>
+      <w:r>
+        <w:rPr>
+          <w:rFonts w:ascii="Times New Roman" w:hAnsi="Times New Roman" w:cs="Times New Roman"/>
+          <w:sz w:val="24"/>
+          <w:szCs w:val="24"/>
+        </w:rPr>
+        <w:t>Smart</w:t>
+      </w:r>
+      <w:proofErr w:type="spellEnd"/>
+      <w:r>
+        <w:rPr>
+          <w:rFonts w:ascii="Times New Roman" w:hAnsi="Times New Roman" w:cs="Times New Roman"/>
+          <w:sz w:val="24"/>
+          <w:szCs w:val="24"/>
+        </w:rPr>
+        <w:t xml:space="preserve"> </w:t>
+      </w:r>
+      <w:proofErr w:type="spellStart"/>
+      <w:r>
+        <w:rPr>
+          <w:rFonts w:ascii="Times New Roman" w:hAnsi="Times New Roman" w:cs="Times New Roman"/>
+          <w:sz w:val="24"/>
+          <w:szCs w:val="24"/>
+        </w:rPr>
+        <w:t>Garden</w:t>
+      </w:r>
+      <w:proofErr w:type="spellEnd"/>
+      <w:r>
+        <w:rPr>
+          <w:rFonts w:ascii="Times New Roman" w:hAnsi="Times New Roman" w:cs="Times New Roman"/>
+          <w:sz w:val="24"/>
+          <w:szCs w:val="24"/>
+        </w:rPr>
+        <w:t xml:space="preserve"> készlettel ellentétben </w:t>
+      </w:r>
+      <w:r>
+        <w:rPr>
+          <w:rFonts w:ascii="Times New Roman" w:hAnsi="Times New Roman" w:cs="Times New Roman"/>
+          <w:sz w:val="24"/>
+          <w:szCs w:val="24"/>
+        </w:rPr>
+        <w:t>már használ érzékelőt a növény megfigyeléséhez, továbbra is csupán egy korlátozott képet ad környezeti tényezőiről.</w:t>
+      </w:r>
+    </w:p>
+    <w:bookmarkEnd w:id="4"/>
+    <w:p>
+      <w:pPr>
+        <w:spacing w:line="360" w:lineRule="auto"/>
         <w:ind w:firstLine="426"/>
         <w:jc w:val="both"/>
         <w:rPr>
@@ -3673,6 +3939,7 @@
           <w:sz w:val="24"/>
           <w:szCs w:val="24"/>
         </w:rPr>
+        <w:lastRenderedPageBreak/>
         <w:t xml:space="preserve">Saját okos cserepem megvalósítása során az </w:t>
       </w:r>
       <w:proofErr w:type="spellStart"/>
@@ -3727,23 +3994,121 @@
           <w:sz w:val="24"/>
           <w:szCs w:val="24"/>
         </w:rPr>
-        <w:t>-t vettem alapul. Az összes, már létező megvalósítás közül ez az eszköz volt a legkedveltebb a vevők által, ez az okos cserép vette figyelembe a növények legtöbb szükségletét</w:t>
-      </w:r>
-      <w:r>
-        <w:rPr>
-          <w:rFonts w:ascii="Times New Roman" w:hAnsi="Times New Roman" w:cs="Times New Roman"/>
-          <w:sz w:val="24"/>
-          <w:szCs w:val="24"/>
-        </w:rPr>
-        <w:t>, ezzel a legnagyobb segítséget nyújtva a gondozásukhoz</w:t>
-      </w:r>
-      <w:r>
-        <w:rPr>
-          <w:rFonts w:ascii="Times New Roman" w:hAnsi="Times New Roman" w:cs="Times New Roman"/>
-          <w:sz w:val="24"/>
-          <w:szCs w:val="24"/>
-        </w:rPr>
-        <w:t>.</w:t>
+        <w:t>-t</w:t>
+      </w:r>
+      <w:r>
+        <w:rPr>
+          <w:rFonts w:ascii="Times New Roman" w:hAnsi="Times New Roman" w:cs="Times New Roman"/>
+          <w:sz w:val="24"/>
+          <w:szCs w:val="24"/>
+        </w:rPr>
+        <w:t xml:space="preserve"> és a </w:t>
+      </w:r>
+      <w:proofErr w:type="spellStart"/>
+      <w:r>
+        <w:rPr>
+          <w:rFonts w:ascii="Times New Roman" w:hAnsi="Times New Roman" w:cs="Times New Roman"/>
+          <w:sz w:val="24"/>
+          <w:szCs w:val="24"/>
+        </w:rPr>
+        <w:t>Flaura</w:t>
+      </w:r>
+      <w:proofErr w:type="spellEnd"/>
+      <w:r>
+        <w:rPr>
+          <w:rFonts w:ascii="Times New Roman" w:hAnsi="Times New Roman" w:cs="Times New Roman"/>
+          <w:sz w:val="24"/>
+          <w:szCs w:val="24"/>
+        </w:rPr>
+        <w:t xml:space="preserve"> okos virágcserepeket</w:t>
+      </w:r>
+      <w:r>
+        <w:rPr>
+          <w:rFonts w:ascii="Times New Roman" w:hAnsi="Times New Roman" w:cs="Times New Roman"/>
+          <w:sz w:val="24"/>
+          <w:szCs w:val="24"/>
+        </w:rPr>
+        <w:t xml:space="preserve"> vettem alapul. </w:t>
+      </w:r>
+      <w:r>
+        <w:rPr>
+          <w:rFonts w:ascii="Times New Roman" w:hAnsi="Times New Roman" w:cs="Times New Roman"/>
+          <w:sz w:val="24"/>
+          <w:szCs w:val="24"/>
+        </w:rPr>
+        <w:t xml:space="preserve">Úgy éreztem, hogy a </w:t>
+      </w:r>
+      <w:proofErr w:type="spellStart"/>
+      <w:r>
+        <w:rPr>
+          <w:rFonts w:ascii="Times New Roman" w:hAnsi="Times New Roman" w:cs="Times New Roman"/>
+          <w:sz w:val="24"/>
+          <w:szCs w:val="24"/>
+        </w:rPr>
+        <w:t>Flaura</w:t>
+      </w:r>
+      <w:proofErr w:type="spellEnd"/>
+      <w:r>
+        <w:rPr>
+          <w:rFonts w:ascii="Times New Roman" w:hAnsi="Times New Roman" w:cs="Times New Roman"/>
+          <w:sz w:val="24"/>
+          <w:szCs w:val="24"/>
+        </w:rPr>
+        <w:t xml:space="preserve"> egy jó kiindulási pont, de kombinálni akartam az </w:t>
+      </w:r>
+      <w:proofErr w:type="spellStart"/>
+      <w:r>
+        <w:rPr>
+          <w:rFonts w:ascii="Times New Roman" w:hAnsi="Times New Roman" w:cs="Times New Roman"/>
+          <w:sz w:val="24"/>
+          <w:szCs w:val="24"/>
+        </w:rPr>
+        <w:t>Ivy</w:t>
+      </w:r>
+      <w:proofErr w:type="spellEnd"/>
+      <w:r>
+        <w:rPr>
+          <w:rFonts w:ascii="Times New Roman" w:hAnsi="Times New Roman" w:cs="Times New Roman"/>
+          <w:sz w:val="24"/>
+          <w:szCs w:val="24"/>
+        </w:rPr>
+        <w:t xml:space="preserve"> </w:t>
+      </w:r>
+      <w:proofErr w:type="spellStart"/>
+      <w:r>
+        <w:rPr>
+          <w:rFonts w:ascii="Times New Roman" w:hAnsi="Times New Roman" w:cs="Times New Roman"/>
+          <w:sz w:val="24"/>
+          <w:szCs w:val="24"/>
+        </w:rPr>
+        <w:t>Smart</w:t>
+      </w:r>
+      <w:proofErr w:type="spellEnd"/>
+      <w:r>
+        <w:rPr>
+          <w:rFonts w:ascii="Times New Roman" w:hAnsi="Times New Roman" w:cs="Times New Roman"/>
+          <w:sz w:val="24"/>
+          <w:szCs w:val="24"/>
+        </w:rPr>
+        <w:t xml:space="preserve"> </w:t>
+      </w:r>
+      <w:proofErr w:type="spellStart"/>
+      <w:r>
+        <w:rPr>
+          <w:rFonts w:ascii="Times New Roman" w:hAnsi="Times New Roman" w:cs="Times New Roman"/>
+          <w:sz w:val="24"/>
+          <w:szCs w:val="24"/>
+        </w:rPr>
+        <w:t>Planter</w:t>
+      </w:r>
+      <w:proofErr w:type="spellEnd"/>
+      <w:r>
+        <w:rPr>
+          <w:rFonts w:ascii="Times New Roman" w:hAnsi="Times New Roman" w:cs="Times New Roman"/>
+          <w:sz w:val="24"/>
+          <w:szCs w:val="24"/>
+        </w:rPr>
+        <w:t xml:space="preserve"> által megfigyelt további paraméterekkel, ezzel egy szélesebb körű, nagyobb segítséget nyújtó virágcserepet létrehozva.</w:t>
       </w:r>
     </w:p>
     <w:p/>
@@ -3924,604 +4289,521 @@
     <w:p/>
     <w:p/>
     <w:p/>
-    <w:p/>
-    <w:p>
-      <w:pPr>
-        <w:spacing w:line="360" w:lineRule="auto"/>
-        <w:ind w:firstLine="426"/>
-        <w:jc w:val="both"/>
-        <w:rPr>
-          <w:rFonts w:ascii="Times New Roman" w:hAnsi="Times New Roman" w:cs="Times New Roman"/>
-          <w:sz w:val="24"/>
-          <w:szCs w:val="24"/>
-        </w:rPr>
-      </w:pPr>
-      <w:r>
-        <w:rPr>
-          <w:rFonts w:ascii="Times New Roman" w:hAnsi="Times New Roman" w:cs="Times New Roman"/>
-          <w:sz w:val="24"/>
-          <w:szCs w:val="24"/>
-        </w:rPr>
-        <w:t xml:space="preserve">A tervezés során úgy határoztam, hogy a felhasználói felültet egy weboldal formájában fogom megvalósítani. Ennek a döntésnek több oka is volt. Elsősorban </w:t>
-      </w:r>
-      <w:r>
-        <w:rPr>
-          <w:rFonts w:ascii="Times New Roman" w:hAnsi="Times New Roman" w:cs="Times New Roman"/>
-          <w:sz w:val="24"/>
-          <w:szCs w:val="24"/>
-        </w:rPr>
-        <w:t>azért esett erre a választásom, mert azt szerettem volna, hogy a kész alkalmazás ne csak mobilról lehessen elérhető. az is a webalkalmazás mellett szólt egy telefonos applikációval szemben, hogy a webes felület megtervezésében már rendelkeztem korábbi tapasztalattal, illetve nem volt a fejlesztéséhez külön alkalmazásra szükségem. Ezentúl az, hogy a teljes projekthez a hardveren kívül csak egy laptopra volt szükségem</w:t>
-      </w:r>
-      <w:r>
-        <w:rPr>
-          <w:rFonts w:ascii="Times New Roman" w:hAnsi="Times New Roman" w:cs="Times New Roman"/>
-          <w:sz w:val="24"/>
-          <w:szCs w:val="24"/>
-        </w:rPr>
-        <w:t>,</w:t>
-      </w:r>
-      <w:r>
-        <w:rPr>
-          <w:rFonts w:ascii="Times New Roman" w:hAnsi="Times New Roman" w:cs="Times New Roman"/>
-          <w:sz w:val="24"/>
-          <w:szCs w:val="24"/>
-        </w:rPr>
-        <w:t xml:space="preserve"> tovább egyszerűsítette a </w:t>
-      </w:r>
-      <w:r>
-        <w:rPr>
-          <w:rFonts w:ascii="Times New Roman" w:hAnsi="Times New Roman" w:cs="Times New Roman"/>
-          <w:sz w:val="24"/>
-          <w:szCs w:val="24"/>
-        </w:rPr>
-        <w:t>megvalósítást</w:t>
-      </w:r>
-      <w:r>
-        <w:rPr>
-          <w:rFonts w:ascii="Times New Roman" w:hAnsi="Times New Roman" w:cs="Times New Roman"/>
-          <w:sz w:val="24"/>
-          <w:szCs w:val="24"/>
-        </w:rPr>
-        <w:t>, engedve, hogy a korlátozott időn belül minél több funkcionalitást megva</w:t>
-      </w:r>
-      <w:r>
-        <w:rPr>
-          <w:rFonts w:ascii="Times New Roman" w:hAnsi="Times New Roman" w:cs="Times New Roman"/>
-          <w:sz w:val="24"/>
-          <w:szCs w:val="24"/>
-        </w:rPr>
-        <w:t>l</w:t>
-      </w:r>
-      <w:r>
-        <w:rPr>
-          <w:rFonts w:ascii="Times New Roman" w:hAnsi="Times New Roman" w:cs="Times New Roman"/>
-          <w:sz w:val="24"/>
-          <w:szCs w:val="24"/>
-        </w:rPr>
-        <w:t>ósítsak.</w:t>
-      </w:r>
-    </w:p>
-    <w:p>
-      <w:pPr>
-        <w:spacing w:line="360" w:lineRule="auto"/>
-        <w:ind w:firstLine="426"/>
-        <w:jc w:val="both"/>
-        <w:rPr>
-          <w:rFonts w:ascii="Times New Roman" w:hAnsi="Times New Roman" w:cs="Times New Roman"/>
-          <w:sz w:val="24"/>
-          <w:szCs w:val="24"/>
-        </w:rPr>
-      </w:pPr>
-      <w:r>
-        <w:rPr>
-          <w:rFonts w:ascii="Times New Roman" w:hAnsi="Times New Roman" w:cs="Times New Roman"/>
-          <w:sz w:val="24"/>
-          <w:szCs w:val="24"/>
-        </w:rPr>
-        <w:t>A felhasználói felület eléréséhez be kell jelentkeznünk egy felhasználónévvel és a hozzátartozó helyes jelszóval. Erre azért van szükség, hogy több felhasználó esetén mindenki csak a saját növényeihez tartozó adatokhoz férjen hozzá. Ha még nem rendelkezünk fiókkal, az ehhez létrehozott linkre kattintva van lehetőségünk létrehozni egyet. Ezután az oldal visszairányít minket a bejelentkezéshez.</w:t>
-      </w:r>
-      <w:r>
-        <w:rPr>
-          <w:rFonts w:ascii="Times New Roman" w:hAnsi="Times New Roman" w:cs="Times New Roman"/>
-          <w:sz w:val="24"/>
-          <w:szCs w:val="24"/>
-        </w:rPr>
-        <w:t xml:space="preserve"> Az oldal figyelmeztet rá, ha olyan felhasználónévvel próbálunk bejelentkezni, ami nincs benne az adatbázisban, emellett azt is közli velünk, ha egy létező felhasználónévhez helytelen jelszót írtunk be.</w:t>
-      </w:r>
-    </w:p>
-    <w:p>
-      <w:pPr>
-        <w:spacing w:line="360" w:lineRule="auto"/>
-        <w:ind w:firstLine="426"/>
-        <w:jc w:val="both"/>
-        <w:rPr>
-          <w:rFonts w:ascii="Times New Roman" w:hAnsi="Times New Roman" w:cs="Times New Roman"/>
-          <w:sz w:val="24"/>
-          <w:szCs w:val="24"/>
-        </w:rPr>
-      </w:pPr>
-      <w:r>
-        <w:rPr>
-          <w:rFonts w:ascii="Times New Roman" w:hAnsi="Times New Roman" w:cs="Times New Roman"/>
-          <w:sz w:val="24"/>
-          <w:szCs w:val="24"/>
-        </w:rPr>
-        <w:t>A bejelentkezést követően meg tudjuk tekinteni a jelenleg megfigyelés alatt álló növényünket vagy növényeinket.</w:t>
-      </w:r>
-      <w:r>
-        <w:rPr>
-          <w:rFonts w:ascii="Times New Roman" w:hAnsi="Times New Roman" w:cs="Times New Roman"/>
-          <w:sz w:val="24"/>
-          <w:szCs w:val="24"/>
-        </w:rPr>
-        <w:t xml:space="preserve"> Minden növényünknek, ami rendelkezik elérhető mérési </w:t>
-      </w:r>
-      <w:r>
-        <w:rPr>
-          <w:rFonts w:ascii="Times New Roman" w:hAnsi="Times New Roman" w:cs="Times New Roman"/>
-          <w:sz w:val="24"/>
-          <w:szCs w:val="24"/>
-        </w:rPr>
-        <w:lastRenderedPageBreak/>
-        <w:t xml:space="preserve">adatokkal, láthatjuk a környezeti hőmérsékletét, páratartalmát, a talaj nedvességszintjének és az </w:t>
-      </w:r>
-      <w:r>
-        <w:rPr>
-          <w:rFonts w:ascii="Times New Roman" w:hAnsi="Times New Roman" w:cs="Times New Roman"/>
-          <w:sz w:val="24"/>
-          <w:szCs w:val="24"/>
-        </w:rPr>
-        <w:t>az</w:t>
-      </w:r>
-      <w:r>
-        <w:rPr>
-          <w:rFonts w:ascii="Times New Roman" w:hAnsi="Times New Roman" w:cs="Times New Roman"/>
-          <w:sz w:val="24"/>
-          <w:szCs w:val="24"/>
-        </w:rPr>
-        <w:t xml:space="preserve">t ért fény intenzitásának százalékos mértékét. A mért adatok alatt megtaláljuk, hogy a növény melyik MAC című </w:t>
-      </w:r>
-      <w:proofErr w:type="spellStart"/>
-      <w:r>
-        <w:rPr>
-          <w:rFonts w:ascii="Times New Roman" w:hAnsi="Times New Roman" w:cs="Times New Roman"/>
-          <w:sz w:val="24"/>
-          <w:szCs w:val="24"/>
-        </w:rPr>
-        <w:t>Arduinohoz</w:t>
-      </w:r>
-      <w:proofErr w:type="spellEnd"/>
-      <w:r>
-        <w:rPr>
-          <w:rFonts w:ascii="Times New Roman" w:hAnsi="Times New Roman" w:cs="Times New Roman"/>
-          <w:sz w:val="24"/>
-          <w:szCs w:val="24"/>
-        </w:rPr>
-        <w:t xml:space="preserve"> van hozzárendelve, ezentúl az is megjelenítésre kerül, hogy a látható adatokat mikor mértük.</w:t>
-      </w:r>
-    </w:p>
-    <w:p>
-      <w:pPr>
-        <w:spacing w:line="360" w:lineRule="auto"/>
-        <w:ind w:firstLine="426"/>
-        <w:jc w:val="both"/>
-        <w:rPr>
-          <w:rFonts w:ascii="Times New Roman" w:hAnsi="Times New Roman" w:cs="Times New Roman"/>
-          <w:sz w:val="24"/>
-          <w:szCs w:val="24"/>
-        </w:rPr>
-      </w:pPr>
-      <w:r>
-        <w:rPr>
-          <w:rFonts w:ascii="Times New Roman" w:hAnsi="Times New Roman" w:cs="Times New Roman"/>
-          <w:sz w:val="24"/>
-          <w:szCs w:val="24"/>
-        </w:rPr>
-        <w:t xml:space="preserve">A jobb felső sarokban található két gomb, az első lenyomásával megjelenik a felület, amin keresztül új növényt tudunk hozzáadni a megfigyelt növényeinkhez. Ehhez segítségül szolgál egy legördülő lista, amely megjeleníti a fő növény táblában lévő növényeket, emellett egy másik legördülő lista, ami az elérhető </w:t>
-      </w:r>
-      <w:proofErr w:type="spellStart"/>
-      <w:r>
-        <w:rPr>
-          <w:rFonts w:ascii="Times New Roman" w:hAnsi="Times New Roman" w:cs="Times New Roman"/>
-          <w:sz w:val="24"/>
-          <w:szCs w:val="24"/>
-        </w:rPr>
-        <w:t>Arduino</w:t>
-      </w:r>
-      <w:proofErr w:type="spellEnd"/>
-      <w:r>
-        <w:rPr>
-          <w:rFonts w:ascii="Times New Roman" w:hAnsi="Times New Roman" w:cs="Times New Roman"/>
-          <w:sz w:val="24"/>
-          <w:szCs w:val="24"/>
-        </w:rPr>
-        <w:t xml:space="preserve"> készülékek </w:t>
-      </w:r>
-      <w:r>
-        <w:rPr>
-          <w:rFonts w:ascii="Times New Roman" w:hAnsi="Times New Roman" w:cs="Times New Roman"/>
-          <w:sz w:val="24"/>
-          <w:szCs w:val="24"/>
-        </w:rPr>
-        <w:t>MAC</w:t>
-      </w:r>
-      <w:r>
-        <w:rPr>
-          <w:rFonts w:ascii="Times New Roman" w:hAnsi="Times New Roman" w:cs="Times New Roman"/>
-          <w:sz w:val="24"/>
-          <w:szCs w:val="24"/>
-        </w:rPr>
-        <w:t xml:space="preserve"> címeit sorakoztatja fel. Itt tudjuk azt is meghatározni, melyik eszköz legyen az adott növényhez rendelve, az </w:t>
-      </w:r>
-      <w:proofErr w:type="spellStart"/>
-      <w:r>
-        <w:rPr>
-          <w:rFonts w:ascii="Times New Roman" w:hAnsi="Times New Roman" w:cs="Times New Roman"/>
-          <w:sz w:val="24"/>
-          <w:szCs w:val="24"/>
-        </w:rPr>
-        <w:t>Arduino</w:t>
-      </w:r>
-      <w:proofErr w:type="spellEnd"/>
-      <w:r>
-        <w:rPr>
-          <w:rFonts w:ascii="Times New Roman" w:hAnsi="Times New Roman" w:cs="Times New Roman"/>
-          <w:sz w:val="24"/>
-          <w:szCs w:val="24"/>
-        </w:rPr>
-        <w:t xml:space="preserve"> ezután ennek a növénynek az azonosítójával fogja feltölteni a mért adatait a </w:t>
-      </w:r>
-      <w:proofErr w:type="spellStart"/>
-      <w:r>
-        <w:rPr>
-          <w:rFonts w:ascii="Times New Roman" w:hAnsi="Times New Roman" w:cs="Times New Roman"/>
-          <w:sz w:val="24"/>
-          <w:szCs w:val="24"/>
-        </w:rPr>
-        <w:t>weekly_data</w:t>
-      </w:r>
-      <w:proofErr w:type="spellEnd"/>
-      <w:r>
-        <w:rPr>
-          <w:rFonts w:ascii="Times New Roman" w:hAnsi="Times New Roman" w:cs="Times New Roman"/>
-          <w:sz w:val="24"/>
-          <w:szCs w:val="24"/>
-        </w:rPr>
-        <w:t xml:space="preserve"> táblába. </w:t>
-      </w:r>
-      <w:r>
-        <w:rPr>
-          <w:rFonts w:ascii="Times New Roman" w:hAnsi="Times New Roman" w:cs="Times New Roman"/>
-          <w:sz w:val="24"/>
-          <w:szCs w:val="24"/>
-        </w:rPr>
-        <w:t>Ha hozzáadtunk minden növényt, amit szerettünk volna, a „Mégse” gombra kattintva visszakerülünk a főoldalra, ahol a „Növények betöltése” gomb segítségével egyből meg is tudjuk jeleníteni az immár frissített növény-listánkat.</w:t>
-      </w:r>
-    </w:p>
-    <w:p>
-      <w:pPr>
-        <w:spacing w:line="360" w:lineRule="auto"/>
-        <w:ind w:firstLine="426"/>
-        <w:jc w:val="both"/>
-        <w:rPr>
-          <w:rFonts w:ascii="Times New Roman" w:hAnsi="Times New Roman" w:cs="Times New Roman"/>
-          <w:sz w:val="24"/>
-          <w:szCs w:val="24"/>
-        </w:rPr>
-      </w:pPr>
-      <w:r>
-        <w:rPr>
-          <w:rFonts w:ascii="Times New Roman" w:hAnsi="Times New Roman" w:cs="Times New Roman"/>
-          <w:sz w:val="24"/>
-          <w:szCs w:val="24"/>
-        </w:rPr>
-        <w:t xml:space="preserve">Ha egy növényt már nem kívánunk tovább montírozni, a jobb felső sarokban elhelyezett „Növény törlése” gombra kattintva kitörölhetjük azt az adatbázisból. </w:t>
-      </w:r>
-      <w:r>
-        <w:rPr>
-          <w:rFonts w:ascii="Times New Roman" w:hAnsi="Times New Roman" w:cs="Times New Roman"/>
-          <w:sz w:val="24"/>
-          <w:szCs w:val="24"/>
-        </w:rPr>
-        <w:t>Egy, a növény hozzáadásához igen hasonló, felületre irányítva a legördülő listából kiválaszthatjuk, melyik növényünket szeretnénk kitörölni. Az oldal felhívja rá a figyelmünket, hogy a növény törlésével az összes hozzá tartozó adatunk is törlésre fog kerülni. A törlés után a növény-hozzáadáshoz hasonlóan tudunk visszanavigálni a főoldalra.</w:t>
-      </w:r>
-    </w:p>
-    <w:p>
-      <w:pPr>
-        <w:spacing w:line="360" w:lineRule="auto"/>
-        <w:ind w:firstLine="426"/>
-        <w:jc w:val="both"/>
-        <w:rPr>
-          <w:rFonts w:ascii="Times New Roman" w:hAnsi="Times New Roman" w:cs="Times New Roman"/>
-          <w:sz w:val="24"/>
-          <w:szCs w:val="24"/>
-        </w:rPr>
-      </w:pPr>
-      <w:r>
-        <w:rPr>
-          <w:rFonts w:ascii="Times New Roman" w:hAnsi="Times New Roman" w:cs="Times New Roman"/>
-          <w:sz w:val="24"/>
-          <w:szCs w:val="24"/>
-        </w:rPr>
-        <w:t xml:space="preserve">A bal oldalon található „Statisztika” fülre kattintva lehetőséget kapunk a kiválasztott növényünk egy hétre visszamenőleges állapotát megtekinteni. Az öt megjelenő ábra a következőket ábrázolja: az elmúlt hét napban a növény környezetének napi átlag hőmérsékletét, páratartalmát, a növény földjének napi átlag nedvességi szintjét, a növényt ért fény intenzitásának napi átlagát és a növényt ért fény napi mennyiségét. Ezen adatok közül az utolsót leszámítva mindegyik egy szimpla átlagszámítással történik, napi csoportosítással. A növényt ért napi fény mennyisége úgy kerül meghatározásra, hogy az </w:t>
-      </w:r>
-      <w:proofErr w:type="spellStart"/>
-      <w:r>
-        <w:rPr>
-          <w:rFonts w:ascii="Times New Roman" w:hAnsi="Times New Roman" w:cs="Times New Roman"/>
-          <w:sz w:val="24"/>
-          <w:szCs w:val="24"/>
-        </w:rPr>
-        <w:t>Arduino</w:t>
-      </w:r>
-      <w:proofErr w:type="spellEnd"/>
-      <w:r>
-        <w:rPr>
-          <w:rFonts w:ascii="Times New Roman" w:hAnsi="Times New Roman" w:cs="Times New Roman"/>
-          <w:sz w:val="24"/>
-          <w:szCs w:val="24"/>
-        </w:rPr>
-        <w:t xml:space="preserve"> 10 másodpercenként megállapítja, hogy ezen idő alatt a növényt ért fény intenzitása elérte e az 500 lx-os küszöb</w:t>
-      </w:r>
-      <w:r>
-        <w:rPr>
-          <w:rFonts w:ascii="Times New Roman" w:hAnsi="Times New Roman" w:cs="Times New Roman"/>
-          <w:sz w:val="24"/>
-          <w:szCs w:val="24"/>
-        </w:rPr>
-        <w:t xml:space="preserve">értéket. Azért ezt a küszöbértéket határoztam meg, mert az alacsony fényigényű növények számára ez az elfogadott minimum fényintenzitás. Ha a fény erőssége elérte ezt az értéket, akkor a program úgy számítja, hogy abban a 10 másodpercben érte fény a növényt. Ezeket az összeget összeadja és 15 percenként </w:t>
-      </w:r>
-      <w:r>
-        <w:rPr>
-          <w:rFonts w:ascii="Times New Roman" w:hAnsi="Times New Roman" w:cs="Times New Roman"/>
-          <w:sz w:val="24"/>
-          <w:szCs w:val="24"/>
-        </w:rPr>
-        <w:t xml:space="preserve">tovább </w:t>
-      </w:r>
-      <w:r>
-        <w:rPr>
-          <w:rFonts w:ascii="Times New Roman" w:hAnsi="Times New Roman" w:cs="Times New Roman"/>
-          <w:sz w:val="24"/>
-          <w:szCs w:val="24"/>
-        </w:rPr>
-        <w:t>küldi a webszervernek. Ezek után egyszerűen napi összesítésre kerülnek a mért időtartamok.</w:t>
-      </w:r>
-    </w:p>
-    <w:p>
-      <w:pPr>
-        <w:spacing w:line="360" w:lineRule="auto"/>
-        <w:ind w:firstLine="426"/>
-        <w:jc w:val="both"/>
-        <w:rPr>
-          <w:rFonts w:ascii="Times New Roman" w:hAnsi="Times New Roman" w:cs="Times New Roman"/>
-          <w:sz w:val="24"/>
-          <w:szCs w:val="24"/>
-        </w:rPr>
-      </w:pPr>
-      <w:r>
-        <w:rPr>
-          <w:rFonts w:ascii="Times New Roman" w:hAnsi="Times New Roman" w:cs="Times New Roman"/>
-          <w:sz w:val="24"/>
-          <w:szCs w:val="24"/>
-        </w:rPr>
-        <w:lastRenderedPageBreak/>
-        <w:t>Az ábrákon egytől egyig láthatunk egy halvány zöld sávot. Ez a sáv jelzi a növény számára ideális mérési tartományt. Természetesen az adott növénytől függően ez a tartomány változhat.</w:t>
-      </w:r>
-    </w:p>
-    <w:p>
-      <w:pPr>
-        <w:spacing w:line="360" w:lineRule="auto"/>
-        <w:ind w:firstLine="426"/>
-        <w:jc w:val="both"/>
-        <w:rPr>
-          <w:rFonts w:ascii="Times New Roman" w:hAnsi="Times New Roman" w:cs="Times New Roman"/>
-          <w:sz w:val="24"/>
-          <w:szCs w:val="24"/>
-        </w:rPr>
-      </w:pPr>
-      <w:r>
-        <w:rPr>
-          <w:rFonts w:ascii="Times New Roman" w:hAnsi="Times New Roman" w:cs="Times New Roman"/>
-          <w:sz w:val="24"/>
-          <w:szCs w:val="24"/>
-        </w:rPr>
-        <w:t xml:space="preserve">A Statisztikákat megjelenítő oldalon is találunk egy gombot a jobb felső sarokban. Ezúttal a gomb arra szolgál, hogy az adott növényhez tartozó, jelenleg az adatbázisban elérhető, összes adatot </w:t>
-      </w:r>
-      <w:proofErr w:type="spellStart"/>
-      <w:r>
-        <w:rPr>
-          <w:rFonts w:ascii="Times New Roman" w:hAnsi="Times New Roman" w:cs="Times New Roman"/>
-          <w:sz w:val="24"/>
-          <w:szCs w:val="24"/>
-        </w:rPr>
-        <w:t>csv</w:t>
-      </w:r>
-      <w:proofErr w:type="spellEnd"/>
-      <w:r>
-        <w:rPr>
-          <w:rFonts w:ascii="Times New Roman" w:hAnsi="Times New Roman" w:cs="Times New Roman"/>
-          <w:sz w:val="24"/>
-          <w:szCs w:val="24"/>
-        </w:rPr>
-        <w:t xml:space="preserve"> formátumban exportálhassuk. Ennek a funkciónak az előnye, hogy segítségével nem csak a legfrissebb, illetve napi szinten átlagolt mérési adatokat tudjuk megtekinteni, hanem a növényhez tartozó összes méréshez hozzáférhetünk. Abból a szempontból is előnyös lehet, hogy segítségével az egy hétnél régebbi adatokat is vissza tudjuk nézni, ha igényt tartunk rá.</w:t>
-      </w:r>
-    </w:p>
-    <w:p>
-      <w:pPr>
-        <w:spacing w:line="360" w:lineRule="auto"/>
-        <w:ind w:firstLine="426"/>
-        <w:jc w:val="both"/>
-        <w:rPr>
-          <w:rFonts w:ascii="Times New Roman" w:hAnsi="Times New Roman" w:cs="Times New Roman"/>
-          <w:sz w:val="24"/>
-          <w:szCs w:val="24"/>
-        </w:rPr>
-      </w:pPr>
-      <w:r>
-        <w:rPr>
-          <w:rFonts w:ascii="Times New Roman" w:hAnsi="Times New Roman" w:cs="Times New Roman"/>
-          <w:sz w:val="24"/>
-          <w:szCs w:val="24"/>
-        </w:rPr>
-        <w:t>Végül, a bel oldali navigációs sáv utolsó fülére kattintva megjelenik, milyen néven vagyunk bejelentkezve, továbbá lehetőséget kapunk a kijelentkezésre vagy akár a teljes fiók törlésére. A kijelentkezés opció kiválasztása után egy felugró ablak rákérdez, hogy biztosan ki akarunk-e jelentkezni. A „Mégse” gomb megnyomásával a felugró ablak eltűnik, míg a „Kijelentkezés” gomb elirányít minket a bejelentkezési oldalra.</w:t>
-      </w:r>
-    </w:p>
-    <w:p>
-      <w:pPr>
-        <w:spacing w:line="360" w:lineRule="auto"/>
-        <w:ind w:firstLine="426"/>
-        <w:jc w:val="both"/>
-        <w:rPr>
-          <w:rFonts w:ascii="Times New Roman" w:hAnsi="Times New Roman" w:cs="Times New Roman"/>
-          <w:sz w:val="24"/>
-          <w:szCs w:val="24"/>
-        </w:rPr>
-      </w:pPr>
-      <w:r>
-        <w:rPr>
-          <w:rFonts w:ascii="Times New Roman" w:hAnsi="Times New Roman" w:cs="Times New Roman"/>
-          <w:sz w:val="24"/>
-          <w:szCs w:val="24"/>
-        </w:rPr>
-        <w:t>A „Fiók törlése” fülre kattintva figyelmeztetést kapunk, miszerint a fiók törlése maga után vonja a fiókunkhoz tartozó összes növény, illetve az azokhoz tartozó összes adat törlését az adatbázisból</w:t>
-      </w:r>
-      <w:r>
-        <w:rPr>
-          <w:rFonts w:ascii="Times New Roman" w:hAnsi="Times New Roman" w:cs="Times New Roman"/>
-          <w:sz w:val="24"/>
-          <w:szCs w:val="24"/>
-        </w:rPr>
-        <w:t>. A kijelentkezés folyamatával megegyező módon a „Mégse” gomb eltünteti a felugró ablakot, a fiók törlése gomb pedig a sikeres törlés után visszavisz minket a bejelentkezési felületre.</w:t>
-      </w:r>
-    </w:p>
-    <w:p>
-      <w:pPr>
-        <w:spacing w:line="360" w:lineRule="auto"/>
-        <w:ind w:firstLine="426"/>
-        <w:jc w:val="both"/>
-        <w:rPr>
-          <w:rFonts w:ascii="Times New Roman" w:hAnsi="Times New Roman" w:cs="Times New Roman"/>
-          <w:sz w:val="24"/>
-          <w:szCs w:val="24"/>
-        </w:rPr>
-      </w:pPr>
-      <w:r>
-        <w:rPr>
-          <w:rFonts w:ascii="Times New Roman" w:hAnsi="Times New Roman" w:cs="Times New Roman"/>
-          <w:sz w:val="24"/>
-          <w:szCs w:val="24"/>
-        </w:rPr>
-        <w:t xml:space="preserve">Fontos még megemlíteni, hogy ha túl sok időt töltünk a weboldalon anélkül, hogy </w:t>
-      </w:r>
-      <w:proofErr w:type="spellStart"/>
-      <w:r>
-        <w:rPr>
-          <w:rFonts w:ascii="Times New Roman" w:hAnsi="Times New Roman" w:cs="Times New Roman"/>
-          <w:sz w:val="24"/>
-          <w:szCs w:val="24"/>
-        </w:rPr>
-        <w:t>interaktálnánk</w:t>
-      </w:r>
-      <w:proofErr w:type="spellEnd"/>
-      <w:r>
-        <w:rPr>
-          <w:rFonts w:ascii="Times New Roman" w:hAnsi="Times New Roman" w:cs="Times New Roman"/>
-          <w:sz w:val="24"/>
-          <w:szCs w:val="24"/>
-        </w:rPr>
-        <w:t xml:space="preserve"> azzal és ezután újra rá próálunk kattintani valamire, az oldal jelzi, hogy a hozzáférési </w:t>
-      </w:r>
-      <w:proofErr w:type="spellStart"/>
-      <w:r>
-        <w:rPr>
-          <w:rFonts w:ascii="Times New Roman" w:hAnsi="Times New Roman" w:cs="Times New Roman"/>
-          <w:sz w:val="24"/>
-          <w:szCs w:val="24"/>
-        </w:rPr>
-        <w:t>tokenünk</w:t>
-      </w:r>
-      <w:proofErr w:type="spellEnd"/>
-      <w:r>
-        <w:rPr>
-          <w:rFonts w:ascii="Times New Roman" w:hAnsi="Times New Roman" w:cs="Times New Roman"/>
-          <w:sz w:val="24"/>
-          <w:szCs w:val="24"/>
-        </w:rPr>
-        <w:t xml:space="preserve"> érvényessége lejárt, ezért újra be kell jelentkeznünk. Ezután visszairányít minket a bejelentkezéshez. E</w:t>
-      </w:r>
-      <w:r>
-        <w:rPr>
-          <w:rFonts w:ascii="Times New Roman" w:hAnsi="Times New Roman" w:cs="Times New Roman"/>
-          <w:sz w:val="24"/>
-          <w:szCs w:val="24"/>
-        </w:rPr>
-        <w:t>nnek részletesebb működéséről</w:t>
-      </w:r>
-      <w:r>
-        <w:rPr>
-          <w:rFonts w:ascii="Times New Roman" w:hAnsi="Times New Roman" w:cs="Times New Roman"/>
-          <w:sz w:val="24"/>
-          <w:szCs w:val="24"/>
-        </w:rPr>
-        <w:t xml:space="preserve"> a PC oldali architektúra</w:t>
-      </w:r>
-      <w:r>
-        <w:rPr>
-          <w:rFonts w:ascii="Times New Roman" w:hAnsi="Times New Roman" w:cs="Times New Roman"/>
-          <w:sz w:val="24"/>
-          <w:szCs w:val="24"/>
-        </w:rPr>
-        <w:t xml:space="preserve"> fejezetben olvashatunk.</w:t>
-      </w:r>
-    </w:p>
-    <w:p>
-      <w:pPr>
-        <w:spacing w:line="360" w:lineRule="auto"/>
-        <w:jc w:val="both"/>
-        <w:rPr>
-          <w:rFonts w:ascii="Times New Roman" w:hAnsi="Times New Roman" w:cs="Times New Roman"/>
-          <w:sz w:val="24"/>
-          <w:szCs w:val="24"/>
-        </w:rPr>
-      </w:pPr>
-    </w:p>
-    <w:p>
-      <w:pPr>
-        <w:spacing w:line="360" w:lineRule="auto"/>
-        <w:jc w:val="both"/>
-        <w:rPr>
-          <w:rFonts w:ascii="Times New Roman" w:hAnsi="Times New Roman" w:cs="Times New Roman"/>
-          <w:sz w:val="24"/>
-          <w:szCs w:val="24"/>
-        </w:rPr>
-      </w:pPr>
-    </w:p>
-    <w:p>
-      <w:pPr>
-        <w:spacing w:line="360" w:lineRule="auto"/>
-        <w:jc w:val="both"/>
-        <w:rPr>
-          <w:rFonts w:ascii="Times New Roman" w:hAnsi="Times New Roman" w:cs="Times New Roman"/>
+    <w:p>
+      <w:pPr>
+        <w:rPr>
           <w:b/>
           <w:bCs/>
           <w:sz w:val="26"/>
           <w:szCs w:val="26"/>
         </w:rPr>
       </w:pPr>
-      <w:proofErr w:type="spellStart"/>
-      <w:r>
-        <w:rPr>
-          <w:rFonts w:ascii="Times New Roman" w:hAnsi="Times New Roman" w:cs="Times New Roman"/>
+      <w:r>
+        <w:rPr>
           <w:b/>
           <w:bCs/>
           <w:sz w:val="26"/>
           <w:szCs w:val="26"/>
         </w:rPr>
-        <w:t>Arduino</w:t>
+        <w:t>Felhasználói felület</w:t>
+      </w:r>
+    </w:p>
+    <w:p>
+      <w:pPr>
+        <w:spacing w:line="360" w:lineRule="auto"/>
+        <w:ind w:firstLine="426"/>
+        <w:jc w:val="both"/>
+        <w:rPr>
+          <w:rFonts w:ascii="Times New Roman" w:hAnsi="Times New Roman" w:cs="Times New Roman"/>
+          <w:sz w:val="24"/>
+          <w:szCs w:val="24"/>
+        </w:rPr>
+      </w:pPr>
+      <w:bookmarkStart w:id="5" w:name="_Hlk218364613"/>
+      <w:r>
+        <w:rPr>
+          <w:rFonts w:ascii="Times New Roman" w:hAnsi="Times New Roman" w:cs="Times New Roman"/>
+          <w:sz w:val="24"/>
+          <w:szCs w:val="24"/>
+        </w:rPr>
+        <w:t xml:space="preserve">A tervezés során úgy határoztam, hogy a felhasználói felültet egy weboldal formájában fogom megvalósítani. Ennek a döntésnek több oka is volt. Elsősorban </w:t>
+      </w:r>
+      <w:r>
+        <w:rPr>
+          <w:rFonts w:ascii="Times New Roman" w:hAnsi="Times New Roman" w:cs="Times New Roman"/>
+          <w:sz w:val="24"/>
+          <w:szCs w:val="24"/>
+        </w:rPr>
+        <w:t>azért esett erre a választásom, mert azt szerettem volna, hogy a kész alkalmazás ne csak mobilról lehessen elérhető. az is a webalkalmazás mellett szólt egy telefonos applikációval szemben, hogy a webes felület megtervezésében már rendelkeztem korábbi tapasztalattal, illetve nem volt a fejlesztéséhez külön alkalmazásra szükségem. Ezentúl az, hogy a teljes projekthez a hardveren kívül csak egy laptopra volt szükségem</w:t>
+      </w:r>
+      <w:r>
+        <w:rPr>
+          <w:rFonts w:ascii="Times New Roman" w:hAnsi="Times New Roman" w:cs="Times New Roman"/>
+          <w:sz w:val="24"/>
+          <w:szCs w:val="24"/>
+        </w:rPr>
+        <w:t>,</w:t>
+      </w:r>
+      <w:r>
+        <w:rPr>
+          <w:rFonts w:ascii="Times New Roman" w:hAnsi="Times New Roman" w:cs="Times New Roman"/>
+          <w:sz w:val="24"/>
+          <w:szCs w:val="24"/>
+        </w:rPr>
+        <w:t xml:space="preserve"> tovább egyszerűsítette a </w:t>
+      </w:r>
+      <w:r>
+        <w:rPr>
+          <w:rFonts w:ascii="Times New Roman" w:hAnsi="Times New Roman" w:cs="Times New Roman"/>
+          <w:sz w:val="24"/>
+          <w:szCs w:val="24"/>
+        </w:rPr>
+        <w:t>megvalósítást</w:t>
+      </w:r>
+      <w:r>
+        <w:rPr>
+          <w:rFonts w:ascii="Times New Roman" w:hAnsi="Times New Roman" w:cs="Times New Roman"/>
+          <w:sz w:val="24"/>
+          <w:szCs w:val="24"/>
+        </w:rPr>
+        <w:t>, engedve, hogy a korlátozott időn belül minél több funkcionalitást megva</w:t>
+      </w:r>
+      <w:r>
+        <w:rPr>
+          <w:rFonts w:ascii="Times New Roman" w:hAnsi="Times New Roman" w:cs="Times New Roman"/>
+          <w:sz w:val="24"/>
+          <w:szCs w:val="24"/>
+        </w:rPr>
+        <w:t>l</w:t>
+      </w:r>
+      <w:r>
+        <w:rPr>
+          <w:rFonts w:ascii="Times New Roman" w:hAnsi="Times New Roman" w:cs="Times New Roman"/>
+          <w:sz w:val="24"/>
+          <w:szCs w:val="24"/>
+        </w:rPr>
+        <w:t>ósítsak.</w:t>
+      </w:r>
+    </w:p>
+    <w:p>
+      <w:pPr>
+        <w:spacing w:line="360" w:lineRule="auto"/>
+        <w:ind w:firstLine="426"/>
+        <w:jc w:val="both"/>
+        <w:rPr>
+          <w:rFonts w:ascii="Times New Roman" w:hAnsi="Times New Roman" w:cs="Times New Roman"/>
+          <w:sz w:val="24"/>
+          <w:szCs w:val="24"/>
+        </w:rPr>
+      </w:pPr>
+      <w:r>
+        <w:rPr>
+          <w:rFonts w:ascii="Times New Roman" w:hAnsi="Times New Roman" w:cs="Times New Roman"/>
+          <w:sz w:val="24"/>
+          <w:szCs w:val="24"/>
+        </w:rPr>
+        <w:t>A felhasználói felület eléréséhez be kell jelentkeznünk egy felhasználónévvel és a hozzátartozó helyes jelszóval. Erre azért van szükség, hogy több felhasználó esetén mindenki csak a saját növényeihez tartozó adatokhoz férjen hozzá. Ha még nem rendelkezünk fiókkal, az ehhez létrehozott linkre kattintva van lehetőségünk létrehozni egyet. Ezután az oldal visszairányít minket a bejelentkezéshez.</w:t>
+      </w:r>
+      <w:r>
+        <w:rPr>
+          <w:rFonts w:ascii="Times New Roman" w:hAnsi="Times New Roman" w:cs="Times New Roman"/>
+          <w:sz w:val="24"/>
+          <w:szCs w:val="24"/>
+        </w:rPr>
+        <w:t xml:space="preserve"> Az oldal figyelmeztet rá, ha olyan felhasználónévvel próbálunk bejelentkezni, ami nincs benne az adatbázisban, emellett azt is közli velünk, ha egy létező felhasználónévhez helytelen jelszót írtunk be.</w:t>
+      </w:r>
+    </w:p>
+    <w:p>
+      <w:pPr>
+        <w:spacing w:line="360" w:lineRule="auto"/>
+        <w:ind w:firstLine="426"/>
+        <w:jc w:val="both"/>
+        <w:rPr>
+          <w:rFonts w:ascii="Times New Roman" w:hAnsi="Times New Roman" w:cs="Times New Roman"/>
+          <w:sz w:val="24"/>
+          <w:szCs w:val="24"/>
+        </w:rPr>
+      </w:pPr>
+      <w:r>
+        <w:rPr>
+          <w:rFonts w:ascii="Times New Roman" w:hAnsi="Times New Roman" w:cs="Times New Roman"/>
+          <w:sz w:val="24"/>
+          <w:szCs w:val="24"/>
+        </w:rPr>
+        <w:t>A bejelentkezést követően meg tudjuk tekinteni a jelenleg megfigyelés alatt álló növényünket vagy növényeinket.</w:t>
+      </w:r>
+      <w:r>
+        <w:rPr>
+          <w:rFonts w:ascii="Times New Roman" w:hAnsi="Times New Roman" w:cs="Times New Roman"/>
+          <w:sz w:val="24"/>
+          <w:szCs w:val="24"/>
+        </w:rPr>
+        <w:t xml:space="preserve"> Minden növényünknek, ami rendelkezik elérhető mérési adatokkal, láthatjuk a</w:t>
+      </w:r>
+      <w:r>
+        <w:rPr>
+          <w:rFonts w:ascii="Times New Roman" w:hAnsi="Times New Roman" w:cs="Times New Roman"/>
+          <w:sz w:val="24"/>
+          <w:szCs w:val="24"/>
+        </w:rPr>
+        <w:t xml:space="preserve"> legutóbb mért</w:t>
+      </w:r>
+      <w:r>
+        <w:rPr>
+          <w:rFonts w:ascii="Times New Roman" w:hAnsi="Times New Roman" w:cs="Times New Roman"/>
+          <w:sz w:val="24"/>
+          <w:szCs w:val="24"/>
+        </w:rPr>
+        <w:t xml:space="preserve"> környezeti hőmérsékletét, páratartalmát, a talaj nedvességszintjének és az </w:t>
+      </w:r>
+      <w:r>
+        <w:rPr>
+          <w:rFonts w:ascii="Times New Roman" w:hAnsi="Times New Roman" w:cs="Times New Roman"/>
+          <w:sz w:val="24"/>
+          <w:szCs w:val="24"/>
+        </w:rPr>
+        <w:t>az</w:t>
+      </w:r>
+      <w:r>
+        <w:rPr>
+          <w:rFonts w:ascii="Times New Roman" w:hAnsi="Times New Roman" w:cs="Times New Roman"/>
+          <w:sz w:val="24"/>
+          <w:szCs w:val="24"/>
+        </w:rPr>
+        <w:t xml:space="preserve">t ért fény intenzitásának százalékos mértékét. A mért adatok alatt megtaláljuk, hogy a növény melyik MAC című </w:t>
+      </w:r>
+      <w:proofErr w:type="spellStart"/>
+      <w:r>
+        <w:rPr>
+          <w:rFonts w:ascii="Times New Roman" w:hAnsi="Times New Roman" w:cs="Times New Roman"/>
+          <w:sz w:val="24"/>
+          <w:szCs w:val="24"/>
+        </w:rPr>
+        <w:t>Arduinohoz</w:t>
       </w:r>
       <w:proofErr w:type="spellEnd"/>
       <w:r>
+        <w:rPr>
+          <w:rFonts w:ascii="Times New Roman" w:hAnsi="Times New Roman" w:cs="Times New Roman"/>
+          <w:sz w:val="24"/>
+          <w:szCs w:val="24"/>
+        </w:rPr>
+        <w:t xml:space="preserve"> van hozzárendelve, ezentúl az is megjelenítésre kerül, hogy a látható adatokat mikor mértük.</w:t>
+      </w:r>
+    </w:p>
+    <w:p>
+      <w:pPr>
+        <w:spacing w:line="360" w:lineRule="auto"/>
+        <w:ind w:firstLine="426"/>
+        <w:jc w:val="both"/>
+        <w:rPr>
+          <w:rFonts w:ascii="Times New Roman" w:hAnsi="Times New Roman" w:cs="Times New Roman"/>
+          <w:sz w:val="24"/>
+          <w:szCs w:val="24"/>
+        </w:rPr>
+      </w:pPr>
+      <w:r>
+        <w:rPr>
+          <w:rFonts w:ascii="Times New Roman" w:hAnsi="Times New Roman" w:cs="Times New Roman"/>
+          <w:sz w:val="24"/>
+          <w:szCs w:val="24"/>
+        </w:rPr>
+        <w:t xml:space="preserve">A jobb felső sarokban található két gomb, az első lenyomásával megjelenik a felület, amin keresztül új növényt tudunk hozzáadni a megfigyelt növényeinkhez. Ehhez segítségül szolgál egy legördülő lista, amely megjeleníti a fő növény táblában lévő növényeket, emellett egy </w:t>
+      </w:r>
+      <w:r>
+        <w:rPr>
+          <w:rFonts w:ascii="Times New Roman" w:hAnsi="Times New Roman" w:cs="Times New Roman"/>
+          <w:sz w:val="24"/>
+          <w:szCs w:val="24"/>
+        </w:rPr>
+        <w:lastRenderedPageBreak/>
+        <w:t xml:space="preserve">másik legördülő lista, ami az elérhető Arduino készülékek </w:t>
+      </w:r>
+      <w:r>
+        <w:rPr>
+          <w:rFonts w:ascii="Times New Roman" w:hAnsi="Times New Roman" w:cs="Times New Roman"/>
+          <w:sz w:val="24"/>
+          <w:szCs w:val="24"/>
+        </w:rPr>
+        <w:t>MAC</w:t>
+      </w:r>
+      <w:r>
+        <w:rPr>
+          <w:rFonts w:ascii="Times New Roman" w:hAnsi="Times New Roman" w:cs="Times New Roman"/>
+          <w:sz w:val="24"/>
+          <w:szCs w:val="24"/>
+        </w:rPr>
+        <w:t xml:space="preserve"> címeit sorakoztatja fel. Itt tudjuk azt is meghatározni, melyik eszköz legyen az adott növényhez rendelve, az Arduino ezután ennek a növénynek az azonosítójával fogja feltölteni a mért adatait a weekly_data táblába. </w:t>
+      </w:r>
+      <w:r>
+        <w:rPr>
+          <w:rFonts w:ascii="Times New Roman" w:hAnsi="Times New Roman" w:cs="Times New Roman"/>
+          <w:sz w:val="24"/>
+          <w:szCs w:val="24"/>
+        </w:rPr>
+        <w:t>Ha hozzáadtunk minden növényt, amit szerettünk volna, a „Mégse” gombra kattintva visszakerülünk a főoldalra, ahol a „Növények betöltése” gomb segítségével egyből meg is tudjuk jeleníteni az immár frissített növény-listánkat.</w:t>
+      </w:r>
+    </w:p>
+    <w:p>
+      <w:pPr>
+        <w:spacing w:line="360" w:lineRule="auto"/>
+        <w:ind w:firstLine="426"/>
+        <w:jc w:val="both"/>
+        <w:rPr>
+          <w:rFonts w:ascii="Times New Roman" w:hAnsi="Times New Roman" w:cs="Times New Roman"/>
+          <w:sz w:val="24"/>
+          <w:szCs w:val="24"/>
+        </w:rPr>
+      </w:pPr>
+      <w:r>
+        <w:rPr>
+          <w:rFonts w:ascii="Times New Roman" w:hAnsi="Times New Roman" w:cs="Times New Roman"/>
+          <w:sz w:val="24"/>
+          <w:szCs w:val="24"/>
+        </w:rPr>
+        <w:t xml:space="preserve">Ha egy növényt már nem kívánunk tovább montírozni, a jobb felső sarokban elhelyezett „Növény törlése” gombra kattintva kitörölhetjük azt az adatbázisból. </w:t>
+      </w:r>
+      <w:r>
+        <w:rPr>
+          <w:rFonts w:ascii="Times New Roman" w:hAnsi="Times New Roman" w:cs="Times New Roman"/>
+          <w:sz w:val="24"/>
+          <w:szCs w:val="24"/>
+        </w:rPr>
+        <w:t>Egy, a növény hozzáadásához igen hasonló, felületre irányítva a legördülő listából kiválaszthatjuk, melyik növényünket szeretnénk kitörölni. Az oldal felhívja rá a figyelmünket, hogy a növény törlésével az összes hozzá tartozó adatunk is törlésre fog kerülni. A törlés után a növény-hozzáadáshoz hasonlóan tudunk visszanavigálni a főoldalra.</w:t>
+      </w:r>
+    </w:p>
+    <w:p>
+      <w:pPr>
+        <w:spacing w:line="360" w:lineRule="auto"/>
+        <w:ind w:firstLine="426"/>
+        <w:jc w:val="both"/>
+        <w:rPr>
+          <w:rFonts w:ascii="Times New Roman" w:hAnsi="Times New Roman" w:cs="Times New Roman"/>
+          <w:sz w:val="24"/>
+          <w:szCs w:val="24"/>
+        </w:rPr>
+      </w:pPr>
+      <w:r>
+        <w:rPr>
+          <w:rFonts w:ascii="Times New Roman" w:hAnsi="Times New Roman" w:cs="Times New Roman"/>
+          <w:sz w:val="24"/>
+          <w:szCs w:val="24"/>
+        </w:rPr>
+        <w:t>A bal oldalon található „Statisztika” fülre kattintva lehetőséget kapunk a kiválasztott növényünk egy hétre visszamenőleges állapotát megtekinteni. Az öt megjelenő ábra a következőket ábrázolja: az elmúlt hét napban a növény környezetének napi átlag hőmérsékletét, páratartalmát, a növény földjének napi átlag nedvességi szintjét, a növényt ért fény intenzitásának napi átlagát és a növényt ért fény napi mennyiségét. Ezen adatok közül az utolsót leszámítva mindegyik egy szimpla átlagszámítással történik, napi csoportosítással. A növényt ért napi fény mennyisége úgy kerül meghatározásra, hogy az Arduino 10 másodpercenként megállapítja, hogy ezen idő alatt a növényt ért fény intenzitása elérte e az 500 lx-os küszöb</w:t>
+      </w:r>
+      <w:r>
+        <w:rPr>
+          <w:rFonts w:ascii="Times New Roman" w:hAnsi="Times New Roman" w:cs="Times New Roman"/>
+          <w:sz w:val="24"/>
+          <w:szCs w:val="24"/>
+        </w:rPr>
+        <w:t>értéket. Azért ezt a küszöbértéket határoztam meg, mert az alacsony fényigényű növények számára ez az elfogadott minimum fényintenzitás. Ha a fény erőssége elérte ezt az értéket, akkor a program úgy számítja, hogy abban a 10 másodpercben érte fény a növényt. Ezeket az összeget összeadja és 15 percenként tovább küldi a webszervernek. Ezek után egyszerűen napi összesítésre kerülnek a mért időtartamok.</w:t>
+      </w:r>
+    </w:p>
+    <w:p>
+      <w:pPr>
+        <w:spacing w:line="360" w:lineRule="auto"/>
+        <w:ind w:firstLine="426"/>
+        <w:jc w:val="both"/>
+        <w:rPr>
+          <w:rFonts w:ascii="Times New Roman" w:hAnsi="Times New Roman" w:cs="Times New Roman"/>
+          <w:sz w:val="24"/>
+          <w:szCs w:val="24"/>
+        </w:rPr>
+      </w:pPr>
+      <w:r>
+        <w:rPr>
+          <w:rFonts w:ascii="Times New Roman" w:hAnsi="Times New Roman" w:cs="Times New Roman"/>
+          <w:sz w:val="24"/>
+          <w:szCs w:val="24"/>
+        </w:rPr>
+        <w:t>Az ábrákon egytől egyig láthatunk egy halvány zöld sávot. Ez a sáv jelzi a növény számára ideális mérési tartományt. Természetesen az adott növénytől függően ez a tartomány változhat.</w:t>
+      </w:r>
+    </w:p>
+    <w:p>
+      <w:pPr>
+        <w:spacing w:line="360" w:lineRule="auto"/>
+        <w:ind w:firstLine="426"/>
+        <w:jc w:val="both"/>
+        <w:rPr>
+          <w:rFonts w:ascii="Times New Roman" w:hAnsi="Times New Roman" w:cs="Times New Roman"/>
+          <w:sz w:val="24"/>
+          <w:szCs w:val="24"/>
+        </w:rPr>
+      </w:pPr>
+      <w:r>
+        <w:rPr>
+          <w:rFonts w:ascii="Times New Roman" w:hAnsi="Times New Roman" w:cs="Times New Roman"/>
+          <w:sz w:val="24"/>
+          <w:szCs w:val="24"/>
+        </w:rPr>
+        <w:t xml:space="preserve">A Statisztikákat megjelenítő oldalon is találunk egy gombot a jobb felső sarokban. Ezúttal a gomb arra szolgál, hogy az adott növényhez tartozó, jelenleg az adatbázisban elérhető, összes adatot </w:t>
+      </w:r>
+      <w:proofErr w:type="spellStart"/>
+      <w:r>
+        <w:rPr>
+          <w:rFonts w:ascii="Times New Roman" w:hAnsi="Times New Roman" w:cs="Times New Roman"/>
+          <w:sz w:val="24"/>
+          <w:szCs w:val="24"/>
+        </w:rPr>
+        <w:t>csv</w:t>
+      </w:r>
+      <w:proofErr w:type="spellEnd"/>
+      <w:r>
+        <w:rPr>
+          <w:rFonts w:ascii="Times New Roman" w:hAnsi="Times New Roman" w:cs="Times New Roman"/>
+          <w:sz w:val="24"/>
+          <w:szCs w:val="24"/>
+        </w:rPr>
+        <w:t xml:space="preserve"> formátumban exportálhassuk. Ennek a funkciónak az előnye, hogy segítségével nem csak a legfrissebb, illetve napi szinten átlagolt mérési adatokat tudjuk megtekinteni, hanem a </w:t>
+      </w:r>
+      <w:r>
+        <w:rPr>
+          <w:rFonts w:ascii="Times New Roman" w:hAnsi="Times New Roman" w:cs="Times New Roman"/>
+          <w:sz w:val="24"/>
+          <w:szCs w:val="24"/>
+        </w:rPr>
+        <w:lastRenderedPageBreak/>
+        <w:t>növényhez tartozó összes méréshez hozzáférhetünk. Abból a szempontból is előnyös lehet, hogy segítségével az egy hétnél régebbi adatokat is vissza tudjuk nézni, ha igényt tartunk rá.</w:t>
+      </w:r>
+    </w:p>
+    <w:p>
+      <w:pPr>
+        <w:spacing w:line="360" w:lineRule="auto"/>
+        <w:ind w:firstLine="426"/>
+        <w:jc w:val="both"/>
+        <w:rPr>
+          <w:rFonts w:ascii="Times New Roman" w:hAnsi="Times New Roman" w:cs="Times New Roman"/>
+          <w:sz w:val="24"/>
+          <w:szCs w:val="24"/>
+        </w:rPr>
+      </w:pPr>
+      <w:r>
+        <w:rPr>
+          <w:rFonts w:ascii="Times New Roman" w:hAnsi="Times New Roman" w:cs="Times New Roman"/>
+          <w:sz w:val="24"/>
+          <w:szCs w:val="24"/>
+        </w:rPr>
+        <w:t>Végül, a bel oldali navigációs sáv utolsó fülére kattintva megjelenik, milyen néven vagyunk bejelentkezve, továbbá lehetőséget kapunk a kijelentkezésre vagy akár a teljes fiók törlésére. A kijelentkezés opció kiválasztása után egy felugró ablak rákérdez, hogy biztosan ki akarunk-e jelentkezni. A „Mégse” gomb megnyomásával a felugró ablak eltűnik, míg a „Kijelentkezés” gomb elirányít minket a bejelentkezési oldalra.</w:t>
+      </w:r>
+    </w:p>
+    <w:p>
+      <w:pPr>
+        <w:spacing w:line="360" w:lineRule="auto"/>
+        <w:ind w:firstLine="426"/>
+        <w:jc w:val="both"/>
+        <w:rPr>
+          <w:rFonts w:ascii="Times New Roman" w:hAnsi="Times New Roman" w:cs="Times New Roman"/>
+          <w:sz w:val="24"/>
+          <w:szCs w:val="24"/>
+        </w:rPr>
+      </w:pPr>
+      <w:r>
+        <w:rPr>
+          <w:rFonts w:ascii="Times New Roman" w:hAnsi="Times New Roman" w:cs="Times New Roman"/>
+          <w:sz w:val="24"/>
+          <w:szCs w:val="24"/>
+        </w:rPr>
+        <w:t>A „Fiók törlése” fülre kattintva figyelmeztetést kapunk, miszerint a fiók törlése maga után vonja a fiókunkhoz tartozó összes növény, illetve az azokhoz tartozó összes adat törlését az adatbázisból</w:t>
+      </w:r>
+      <w:r>
+        <w:rPr>
+          <w:rFonts w:ascii="Times New Roman" w:hAnsi="Times New Roman" w:cs="Times New Roman"/>
+          <w:sz w:val="24"/>
+          <w:szCs w:val="24"/>
+        </w:rPr>
+        <w:t>. A kijelentkezés folyamatával megegyező módon a „Mégse” gomb eltünteti a felugró ablakot, a fiók törlése gomb pedig a sikeres törlés után visszavisz minket a bejelentkezési felületre.</w:t>
+      </w:r>
+    </w:p>
+    <w:p>
+      <w:pPr>
+        <w:spacing w:line="360" w:lineRule="auto"/>
+        <w:ind w:firstLine="426"/>
+        <w:jc w:val="both"/>
+        <w:rPr>
+          <w:rFonts w:ascii="Times New Roman" w:hAnsi="Times New Roman" w:cs="Times New Roman"/>
+          <w:sz w:val="24"/>
+          <w:szCs w:val="24"/>
+        </w:rPr>
+      </w:pPr>
+      <w:r>
+        <w:rPr>
+          <w:rFonts w:ascii="Times New Roman" w:hAnsi="Times New Roman" w:cs="Times New Roman"/>
+          <w:sz w:val="24"/>
+          <w:szCs w:val="24"/>
+        </w:rPr>
+        <w:t xml:space="preserve">Fontos még megemlíteni, hogy ha túl sok időt töltünk a weboldalon anélkül, hogy </w:t>
+      </w:r>
+      <w:proofErr w:type="spellStart"/>
+      <w:r>
+        <w:rPr>
+          <w:rFonts w:ascii="Times New Roman" w:hAnsi="Times New Roman" w:cs="Times New Roman"/>
+          <w:sz w:val="24"/>
+          <w:szCs w:val="24"/>
+        </w:rPr>
+        <w:t>interaktálnánk</w:t>
+      </w:r>
+      <w:proofErr w:type="spellEnd"/>
+      <w:r>
+        <w:rPr>
+          <w:rFonts w:ascii="Times New Roman" w:hAnsi="Times New Roman" w:cs="Times New Roman"/>
+          <w:sz w:val="24"/>
+          <w:szCs w:val="24"/>
+        </w:rPr>
+        <w:t xml:space="preserve"> azzal és ezután újra rá próálunk kattintani valamire, az oldal jelzi, hogy a hozzáférési tokenünk érvényessége lejárt, ezért újra be kell jelentkeznünk. Ezután visszairányít minket a bejelentkezéshez. E</w:t>
+      </w:r>
+      <w:r>
+        <w:rPr>
+          <w:rFonts w:ascii="Times New Roman" w:hAnsi="Times New Roman" w:cs="Times New Roman"/>
+          <w:sz w:val="24"/>
+          <w:szCs w:val="24"/>
+        </w:rPr>
+        <w:t>nnek részletesebb működéséről</w:t>
+      </w:r>
+      <w:r>
+        <w:rPr>
+          <w:rFonts w:ascii="Times New Roman" w:hAnsi="Times New Roman" w:cs="Times New Roman"/>
+          <w:sz w:val="24"/>
+          <w:szCs w:val="24"/>
+        </w:rPr>
+        <w:t xml:space="preserve"> a PC oldali architektúra</w:t>
+      </w:r>
+      <w:r>
+        <w:rPr>
+          <w:rFonts w:ascii="Times New Roman" w:hAnsi="Times New Roman" w:cs="Times New Roman"/>
+          <w:sz w:val="24"/>
+          <w:szCs w:val="24"/>
+        </w:rPr>
+        <w:t xml:space="preserve"> fejezetben olvashatunk.</w:t>
+      </w:r>
+    </w:p>
+    <w:bookmarkEnd w:id="5"/>
+    <w:p>
+      <w:pPr>
+        <w:spacing w:line="360" w:lineRule="auto"/>
+        <w:jc w:val="both"/>
+        <w:rPr>
+          <w:rFonts w:ascii="Times New Roman" w:hAnsi="Times New Roman" w:cs="Times New Roman"/>
+          <w:sz w:val="24"/>
+          <w:szCs w:val="24"/>
+        </w:rPr>
+      </w:pPr>
+    </w:p>
+    <w:p>
+      <w:pPr>
+        <w:spacing w:line="360" w:lineRule="auto"/>
+        <w:jc w:val="both"/>
+        <w:rPr>
+          <w:rFonts w:ascii="Times New Roman" w:hAnsi="Times New Roman" w:cs="Times New Roman"/>
+          <w:sz w:val="24"/>
+          <w:szCs w:val="24"/>
+        </w:rPr>
+      </w:pPr>
+    </w:p>
+    <w:p>
+      <w:pPr>
+        <w:spacing w:line="360" w:lineRule="auto"/>
+        <w:jc w:val="both"/>
         <w:rPr>
           <w:rFonts w:ascii="Times New Roman" w:hAnsi="Times New Roman" w:cs="Times New Roman"/>
           <w:b/>
@@ -4529,8 +4811,7 @@
           <w:sz w:val="26"/>
           <w:szCs w:val="26"/>
         </w:rPr>
-        <w:t xml:space="preserve"> C</w:t>
-      </w:r>
+      </w:pPr>
       <w:r>
         <w:rPr>
           <w:rFonts w:ascii="Times New Roman" w:hAnsi="Times New Roman" w:cs="Times New Roman"/>
@@ -4539,7 +4820,37 @@
           <w:sz w:val="26"/>
           <w:szCs w:val="26"/>
         </w:rPr>
+        <w:t>Arduino</w:t>
+      </w:r>
+      <w:r>
+        <w:rPr>
+          <w:rFonts w:ascii="Times New Roman" w:hAnsi="Times New Roman" w:cs="Times New Roman"/>
+          <w:b/>
+          <w:bCs/>
+          <w:sz w:val="26"/>
+          <w:szCs w:val="26"/>
+        </w:rPr>
+        <w:t xml:space="preserve"> C</w:t>
+      </w:r>
+      <w:r>
+        <w:rPr>
+          <w:rFonts w:ascii="Times New Roman" w:hAnsi="Times New Roman" w:cs="Times New Roman"/>
+          <w:b/>
+          <w:bCs/>
+          <w:sz w:val="26"/>
+          <w:szCs w:val="26"/>
+        </w:rPr>
         <w:t xml:space="preserve"> kód</w:t>
+      </w:r>
+      <w:r>
+        <w:rPr>
+          <w:rFonts w:ascii="Times New Roman" w:hAnsi="Times New Roman" w:cs="Times New Roman"/>
+          <w:b/>
+          <w:bCs/>
+          <w:sz w:val="26"/>
+          <w:szCs w:val="26"/>
+        </w:rPr>
+        <w:t xml:space="preserve"> megírása, mért értékek helyességének tesztelése</w:t>
       </w:r>
     </w:p>
     <w:p>
@@ -4553,13 +4864,38 @@
           <w:szCs w:val="24"/>
         </w:rPr>
       </w:pPr>
-      <w:r>
-        <w:rPr>
-          <w:rFonts w:ascii="Times New Roman" w:hAnsi="Times New Roman" w:cs="Times New Roman"/>
-          <w:sz w:val="24"/>
-          <w:szCs w:val="24"/>
-        </w:rPr>
-        <w:t xml:space="preserve">Az </w:t>
+      <w:bookmarkStart w:id="6" w:name="_Hlk218364531"/>
+      <w:r>
+        <w:rPr>
+          <w:rFonts w:ascii="Times New Roman" w:hAnsi="Times New Roman" w:cs="Times New Roman"/>
+          <w:sz w:val="24"/>
+          <w:szCs w:val="24"/>
+        </w:rPr>
+        <w:t>Az Arduino programozásához használt kód a PC oldali architektúra első építőköve</w:t>
+      </w:r>
+      <w:r>
+        <w:rPr>
+          <w:rFonts w:ascii="Times New Roman" w:hAnsi="Times New Roman" w:cs="Times New Roman"/>
+          <w:sz w:val="24"/>
+          <w:szCs w:val="24"/>
+        </w:rPr>
+        <w:t>, ez került elsőnek megírásra</w:t>
+      </w:r>
+      <w:r>
+        <w:rPr>
+          <w:rFonts w:ascii="Times New Roman" w:hAnsi="Times New Roman" w:cs="Times New Roman"/>
+          <w:sz w:val="24"/>
+          <w:szCs w:val="24"/>
+        </w:rPr>
+        <w:t>.</w:t>
+      </w:r>
+      <w:r>
+        <w:rPr>
+          <w:rFonts w:ascii="Times New Roman" w:hAnsi="Times New Roman" w:cs="Times New Roman"/>
+          <w:sz w:val="24"/>
+          <w:szCs w:val="24"/>
+        </w:rPr>
+        <w:t xml:space="preserve"> A könnyebb átláthatóság kedvéért a kód részletekben került megírásra, majd később, az azok helyességében való </w:t>
       </w:r>
       <w:proofErr w:type="spellStart"/>
       <w:r>
@@ -4568,7 +4904,7 @@
           <w:sz w:val="24"/>
           <w:szCs w:val="24"/>
         </w:rPr>
-        <w:t>Arduino</w:t>
+        <w:t>megbizonyodás</w:t>
       </w:r>
       <w:proofErr w:type="spellEnd"/>
       <w:r>
@@ -4577,33 +4913,375 @@
           <w:sz w:val="24"/>
           <w:szCs w:val="24"/>
         </w:rPr>
-        <w:t xml:space="preserve"> programozásához használt kód a PC oldali architektúra első építőköve</w:t>
-      </w:r>
-      <w:r>
-        <w:rPr>
-          <w:rFonts w:ascii="Times New Roman" w:hAnsi="Times New Roman" w:cs="Times New Roman"/>
-          <w:sz w:val="24"/>
-          <w:szCs w:val="24"/>
-        </w:rPr>
-        <w:t>, ez került elsőnek megírásra</w:t>
-      </w:r>
-      <w:r>
-        <w:rPr>
-          <w:rFonts w:ascii="Times New Roman" w:hAnsi="Times New Roman" w:cs="Times New Roman"/>
-          <w:sz w:val="24"/>
-          <w:szCs w:val="24"/>
-        </w:rPr>
-        <w:t>.</w:t>
-      </w:r>
-      <w:r>
-        <w:rPr>
-          <w:rFonts w:ascii="Times New Roman" w:hAnsi="Times New Roman" w:cs="Times New Roman"/>
-          <w:sz w:val="24"/>
-          <w:szCs w:val="24"/>
-        </w:rPr>
-        <w:t xml:space="preserve">  </w:t>
-      </w:r>
-    </w:p>
+        <w:t xml:space="preserve"> után lett egybefűzve.</w:t>
+      </w:r>
+    </w:p>
+    <w:p>
+      <w:pPr>
+        <w:spacing w:line="360" w:lineRule="auto"/>
+        <w:ind w:firstLine="426"/>
+        <w:jc w:val="both"/>
+        <w:rPr>
+          <w:rFonts w:ascii="Times New Roman" w:hAnsi="Times New Roman" w:cs="Times New Roman"/>
+          <w:sz w:val="24"/>
+          <w:szCs w:val="24"/>
+        </w:rPr>
+      </w:pPr>
+      <w:r>
+        <w:rPr>
+          <w:rFonts w:ascii="Times New Roman" w:hAnsi="Times New Roman" w:cs="Times New Roman"/>
+          <w:sz w:val="24"/>
+          <w:szCs w:val="24"/>
+        </w:rPr>
+        <w:t xml:space="preserve">Először vegyük szemügyre a talajnedvesség mértékét meghatározó érzékelőt, a soilcap-v1.2-t. Ez egy analóg szenzor, amit a használata előtt be kell kalibrálni. Ehhez először feljegyeztem, hogy 2 órányi folyamatos mérés után mi az az átlag érték, amit szabad levegőn, illetve egy pohár vízbe merítve mér. A levegőn mért értéket vettem 0-nak, míg a vízben mértet 1023-nak, a többi értéket pedig ez alapján a két véglet alapján határoztam meg. Az így </w:t>
+      </w:r>
+      <w:r>
+        <w:rPr>
+          <w:rFonts w:ascii="Times New Roman" w:hAnsi="Times New Roman" w:cs="Times New Roman"/>
+          <w:sz w:val="24"/>
+          <w:szCs w:val="24"/>
+        </w:rPr>
+        <w:t>kapott értékeknek már meg tudtam feleltetni a szenzorhoz talált segédlet táblázatát.</w:t>
+      </w:r>
+    </w:p>
+    <w:p>
+      <w:pPr>
+        <w:spacing w:line="360" w:lineRule="auto"/>
+        <w:ind w:firstLine="426"/>
+        <w:jc w:val="both"/>
+        <w:rPr>
+          <w:rFonts w:ascii="Times New Roman" w:hAnsi="Times New Roman" w:cs="Times New Roman"/>
+          <w:sz w:val="24"/>
+          <w:szCs w:val="24"/>
+        </w:rPr>
+      </w:pPr>
+      <w:r>
+        <w:rPr>
+          <w:rFonts w:ascii="Times New Roman" w:hAnsi="Times New Roman" w:cs="Times New Roman"/>
+          <w:sz w:val="24"/>
+          <w:szCs w:val="24"/>
+        </w:rPr>
+        <w:lastRenderedPageBreak/>
+        <w:t>A digitális szenzorok esetében nem volt szükség kalibrációra, egyszerűen csak le kellett olvasnom a mért értékeket. A</w:t>
+      </w:r>
+      <w:r>
+        <w:rPr>
+          <w:rFonts w:ascii="Times New Roman" w:hAnsi="Times New Roman" w:cs="Times New Roman"/>
+          <w:sz w:val="24"/>
+          <w:szCs w:val="24"/>
+        </w:rPr>
+        <w:t xml:space="preserve"> DHT22-es</w:t>
+      </w:r>
+      <w:r>
+        <w:rPr>
+          <w:rFonts w:ascii="Times New Roman" w:hAnsi="Times New Roman" w:cs="Times New Roman"/>
+          <w:sz w:val="24"/>
+          <w:szCs w:val="24"/>
+        </w:rPr>
+        <w:t xml:space="preserve"> páratartalom és hőmérséklet érzékelő esetében az</w:t>
+      </w:r>
+      <w:r>
+        <w:rPr>
+          <w:rFonts w:ascii="Times New Roman" w:hAnsi="Times New Roman" w:cs="Times New Roman"/>
+          <w:sz w:val="24"/>
+          <w:szCs w:val="24"/>
+        </w:rPr>
+        <w:t xml:space="preserve"> </w:t>
+      </w:r>
+      <w:r>
+        <w:rPr>
+          <w:rFonts w:ascii="Times New Roman" w:hAnsi="Times New Roman" w:cs="Times New Roman"/>
+          <w:sz w:val="24"/>
+          <w:szCs w:val="24"/>
+        </w:rPr>
+        <w:t>ellenőrzést</w:t>
+      </w:r>
+      <w:r>
+        <w:rPr>
+          <w:rFonts w:ascii="Times New Roman" w:hAnsi="Times New Roman" w:cs="Times New Roman"/>
+          <w:sz w:val="24"/>
+          <w:szCs w:val="24"/>
+        </w:rPr>
+        <w:t xml:space="preserve"> úgy végeztem el, hogy a mért értékeket az itthoni digitális hőmérséklet és páratartalom mérő által mért értékekkel vetettem össze. A mért értékek maximum 1-3 tizedes eltérést mutattak mindkét tényező esetében.</w:t>
+      </w:r>
+    </w:p>
+    <w:p>
+      <w:pPr>
+        <w:spacing w:line="360" w:lineRule="auto"/>
+        <w:ind w:firstLine="426"/>
+        <w:jc w:val="both"/>
+        <w:rPr>
+          <w:rFonts w:ascii="Times New Roman" w:hAnsi="Times New Roman" w:cs="Times New Roman"/>
+          <w:sz w:val="24"/>
+          <w:szCs w:val="24"/>
+        </w:rPr>
+      </w:pPr>
+      <w:r>
+        <w:rPr>
+          <w:rFonts w:ascii="Times New Roman" w:hAnsi="Times New Roman" w:cs="Times New Roman"/>
+          <w:sz w:val="24"/>
+          <w:szCs w:val="24"/>
+        </w:rPr>
+        <w:t>A BH1750FVI fényintenzitás szenzor esetében az értékek ellenőrzését a következőképpen végeztem: A korábban meghatározott táblázatban feljegyzett fényviszonyoknak tettem ki az érzékelőt és 1-2 órányi folyamatos mérés közben szúrópróba-szerűen ellenőriztem, hogy a mért értékek a megfelelő tartományba esnek-e bele.</w:t>
+      </w:r>
+    </w:p>
+    <w:p>
+      <w:pPr>
+        <w:spacing w:line="360" w:lineRule="auto"/>
+        <w:ind w:firstLine="426"/>
+        <w:jc w:val="both"/>
+        <w:rPr>
+          <w:rFonts w:ascii="Times New Roman" w:hAnsi="Times New Roman" w:cs="Times New Roman"/>
+          <w:sz w:val="24"/>
+          <w:szCs w:val="24"/>
+        </w:rPr>
+      </w:pPr>
+      <w:bookmarkStart w:id="7" w:name="_Hlk218452193"/>
+      <w:r>
+        <w:rPr>
+          <w:rFonts w:ascii="Times New Roman" w:hAnsi="Times New Roman" w:cs="Times New Roman"/>
+          <w:sz w:val="24"/>
+          <w:szCs w:val="24"/>
+        </w:rPr>
+        <w:t>Miután biztos voltam a szenzorok hibamentes működésében, a hozzájuk tartozó kódrészleteket egy programban egyesítettem.</w:t>
+      </w:r>
+      <w:r>
+        <w:rPr>
+          <w:rFonts w:ascii="Times New Roman" w:hAnsi="Times New Roman" w:cs="Times New Roman"/>
+          <w:sz w:val="24"/>
+          <w:szCs w:val="24"/>
+        </w:rPr>
+        <w:t xml:space="preserve"> Ezt követően csatlakoztattam az LCD kijelzőt is a rendszerhez, kiíratva rajta a valós időben mért értékeket.</w:t>
+      </w:r>
+    </w:p>
+    <w:p>
+      <w:pPr>
+        <w:spacing w:line="360" w:lineRule="auto"/>
+        <w:ind w:firstLine="426"/>
+        <w:jc w:val="both"/>
+        <w:rPr>
+          <w:rFonts w:ascii="Times New Roman" w:hAnsi="Times New Roman" w:cs="Times New Roman"/>
+          <w:sz w:val="24"/>
+          <w:szCs w:val="24"/>
+        </w:rPr>
+      </w:pPr>
+      <w:r>
+        <w:rPr>
+          <w:rFonts w:ascii="Times New Roman" w:hAnsi="Times New Roman" w:cs="Times New Roman"/>
+          <w:sz w:val="24"/>
+          <w:szCs w:val="24"/>
+        </w:rPr>
+        <w:t xml:space="preserve">A következő lépés a mért adatok web szervernek való tovább küldésének megvalósítása volt. Ehhez először az </w:t>
+      </w:r>
+      <w:proofErr w:type="spellStart"/>
+      <w:r>
+        <w:rPr>
+          <w:rFonts w:ascii="Times New Roman" w:hAnsi="Times New Roman" w:cs="Times New Roman"/>
+          <w:sz w:val="24"/>
+          <w:szCs w:val="24"/>
+        </w:rPr>
+        <w:t>Arduinonak</w:t>
+      </w:r>
+      <w:proofErr w:type="spellEnd"/>
+      <w:r>
+        <w:rPr>
+          <w:rFonts w:ascii="Times New Roman" w:hAnsi="Times New Roman" w:cs="Times New Roman"/>
+          <w:sz w:val="24"/>
+          <w:szCs w:val="24"/>
+        </w:rPr>
+        <w:t xml:space="preserve"> kapcsolódnia kellett a WiFi hálózathoz.</w:t>
+      </w:r>
+      <w:r>
+        <w:rPr>
+          <w:rFonts w:ascii="Times New Roman" w:hAnsi="Times New Roman" w:cs="Times New Roman"/>
+          <w:sz w:val="24"/>
+          <w:szCs w:val="24"/>
+        </w:rPr>
+        <w:t xml:space="preserve"> Ezután egy http request formájában már kapcsolódni tud a web szerverrel és azon keresztül képes az általa mért adatokat az adatbázisba feltölteni.</w:t>
+      </w:r>
+    </w:p>
+    <w:bookmarkEnd w:id="7"/>
+    <w:p>
+      <w:pPr>
+        <w:spacing w:line="360" w:lineRule="auto"/>
+        <w:ind w:firstLine="426"/>
+        <w:jc w:val="both"/>
+        <w:rPr>
+          <w:rFonts w:ascii="Times New Roman" w:hAnsi="Times New Roman" w:cs="Times New Roman"/>
+          <w:sz w:val="24"/>
+          <w:szCs w:val="24"/>
+        </w:rPr>
+      </w:pPr>
+    </w:p>
+    <w:p>
+      <w:pPr>
+        <w:spacing w:line="360" w:lineRule="auto"/>
+        <w:jc w:val="both"/>
+        <w:rPr>
+          <w:rFonts w:ascii="Times New Roman" w:hAnsi="Times New Roman" w:cs="Times New Roman"/>
+          <w:b/>
+          <w:bCs/>
+          <w:sz w:val="26"/>
+          <w:szCs w:val="26"/>
+        </w:rPr>
+      </w:pPr>
+      <w:r>
+        <w:rPr>
+          <w:rFonts w:ascii="Times New Roman" w:hAnsi="Times New Roman" w:cs="Times New Roman"/>
+          <w:b/>
+          <w:bCs/>
+          <w:sz w:val="26"/>
+          <w:szCs w:val="26"/>
+        </w:rPr>
+        <w:t>A felhasználói felület mögötti kód</w:t>
+      </w:r>
+    </w:p>
+    <w:p>
+      <w:pPr>
+        <w:spacing w:line="360" w:lineRule="auto"/>
+        <w:ind w:firstLine="426"/>
+        <w:jc w:val="both"/>
+        <w:rPr>
+          <w:rFonts w:ascii="Times New Roman" w:hAnsi="Times New Roman" w:cs="Times New Roman"/>
+          <w:sz w:val="24"/>
+          <w:szCs w:val="24"/>
+        </w:rPr>
+      </w:pPr>
+      <w:r>
+        <w:rPr>
+          <w:rFonts w:ascii="Times New Roman" w:hAnsi="Times New Roman" w:cs="Times New Roman"/>
+          <w:sz w:val="24"/>
+          <w:szCs w:val="24"/>
+        </w:rPr>
+        <w:t xml:space="preserve">A felhasználói felület mögött rejlő kód a </w:t>
+      </w:r>
+      <w:proofErr w:type="spellStart"/>
+      <w:r>
+        <w:rPr>
+          <w:rFonts w:ascii="Times New Roman" w:hAnsi="Times New Roman" w:cs="Times New Roman"/>
+          <w:sz w:val="24"/>
+          <w:szCs w:val="24"/>
+        </w:rPr>
+        <w:t>javascript</w:t>
+      </w:r>
+      <w:proofErr w:type="spellEnd"/>
+      <w:r>
+        <w:rPr>
+          <w:rFonts w:ascii="Times New Roman" w:hAnsi="Times New Roman" w:cs="Times New Roman"/>
+          <w:sz w:val="24"/>
+          <w:szCs w:val="24"/>
+        </w:rPr>
+        <w:t xml:space="preserve"> és </w:t>
+      </w:r>
+      <w:proofErr w:type="spellStart"/>
+      <w:r>
+        <w:rPr>
+          <w:rFonts w:ascii="Times New Roman" w:hAnsi="Times New Roman" w:cs="Times New Roman"/>
+          <w:sz w:val="24"/>
+          <w:szCs w:val="24"/>
+        </w:rPr>
+        <w:t>html</w:t>
+      </w:r>
+      <w:proofErr w:type="spellEnd"/>
+      <w:r>
+        <w:rPr>
+          <w:rFonts w:ascii="Times New Roman" w:hAnsi="Times New Roman" w:cs="Times New Roman"/>
+          <w:sz w:val="24"/>
+          <w:szCs w:val="24"/>
+        </w:rPr>
+        <w:t xml:space="preserve"> kódnyelvek közös használatával lett megalkotva. Kifejezetten összetett, ezért részletenként fogom átvenni, kitérve minden létfontosságú részletre.</w:t>
+      </w:r>
+    </w:p>
+    <w:p>
+      <w:pPr>
+        <w:spacing w:line="360" w:lineRule="auto"/>
+        <w:ind w:firstLine="426"/>
+        <w:jc w:val="both"/>
+        <w:rPr>
+          <w:rFonts w:ascii="Times New Roman" w:hAnsi="Times New Roman" w:cs="Times New Roman"/>
+          <w:sz w:val="24"/>
+          <w:szCs w:val="24"/>
+        </w:rPr>
+      </w:pPr>
+      <w:r>
+        <w:rPr>
+          <w:rFonts w:ascii="Times New Roman" w:hAnsi="Times New Roman" w:cs="Times New Roman"/>
+          <w:sz w:val="24"/>
+          <w:szCs w:val="24"/>
+        </w:rPr>
+        <w:t>Kezdetnek vegyük a bejelentkezési felület működéséért és megjelenéséért felelős kódrészleteket.</w:t>
+      </w:r>
+    </w:p>
+    <w:p>
+      <w:pPr>
+        <w:spacing w:line="360" w:lineRule="auto"/>
+        <w:ind w:firstLine="426"/>
+        <w:jc w:val="both"/>
+        <w:rPr>
+          <w:rFonts w:ascii="Times New Roman" w:hAnsi="Times New Roman" w:cs="Times New Roman"/>
+          <w:sz w:val="24"/>
+          <w:szCs w:val="24"/>
+        </w:rPr>
+      </w:pPr>
+    </w:p>
+    <w:p>
+      <w:pPr>
+        <w:spacing w:line="360" w:lineRule="auto"/>
+        <w:ind w:firstLine="426"/>
+        <w:jc w:val="both"/>
+        <w:rPr>
+          <w:rFonts w:ascii="Times New Roman" w:hAnsi="Times New Roman" w:cs="Times New Roman"/>
+          <w:sz w:val="24"/>
+          <w:szCs w:val="24"/>
+        </w:rPr>
+      </w:pPr>
+    </w:p>
+    <w:p>
+      <w:pPr>
+        <w:pStyle w:val="Cmsor2"/>
+        <w:rPr>
+          <w:color w:val="auto"/>
+        </w:rPr>
+      </w:pPr>
+      <w:bookmarkStart w:id="8" w:name="_Toc218873212"/>
+      <w:r>
+        <w:rPr>
+          <w:color w:val="auto"/>
+        </w:rPr>
+        <w:t>Kész projekt tesztelése</w:t>
+      </w:r>
+      <w:bookmarkEnd w:id="8"/>
+    </w:p>
+    <w:p>
+      <w:r>
+        <w:t>Az okos cserép megvalósítása után elengedhetetlen annak tesztelése is. Ezalatt értendő mind a felhasználói felület helyes működésének, mind a cserép a növény nevelésének segítésében való helytállása.</w:t>
+      </w:r>
+      <w:bookmarkEnd w:id="6"/>
+    </w:p>
+    <w:p/>
+    <w:p>
+      <w:pPr>
+        <w:pStyle w:val="Cmsor2"/>
+      </w:pPr>
+      <w:bookmarkStart w:id="9" w:name="_Toc218976463"/>
+      <w:r>
+        <w:lastRenderedPageBreak/>
+        <w:t>Weboldal elérhetővé tevése nyilvános hálózaton</w:t>
+      </w:r>
+      <w:bookmarkEnd w:id="9"/>
+    </w:p>
+    <w:p>
+      <w:r>
+        <w:t xml:space="preserve">Tekintve, hogy a hozzáférési tokenek generálása már implementálásra került a kódban, a webes applikáció interneten való elérhetőségének magvalósítására irányuló első lépés már megvalósult. </w:t>
+      </w:r>
+      <w:r>
+        <w:rPr>
+          <w:color w:val="EE0000"/>
+        </w:rPr>
+        <w:t>kiegészítendő</w:t>
+      </w:r>
+    </w:p>
+    <w:p/>
     <w:sectPr>
       <w:pgSz w:w="11906" w:h="16838"/>
       <w:pgMar w:top="1417" w:right="1417" w:bottom="1417" w:left="1417" w:header="708" w:footer="708" w:gutter="0"/>

</xml_diff>